<commit_message>
Added categories table and two endpoints for personal expenses and did major cleaning in whole project
</commit_message>
<xml_diff>
--- a/docs/thesis.docx
+++ b/docs/thesis.docx
@@ -586,7 +586,7 @@
             </w:rPr>
             <w:fldChar w:fldCharType="separate"/>
           </w:r>
-          <w:hyperlink w:anchor="_Toc222066114" w:history="1">
+          <w:hyperlink w:anchor="_Toc222231064" w:history="1">
             <w:r>
               <w:rPr>
                 <w:rStyle w:val="Hyperlink"/>
@@ -629,7 +629,7 @@
                 <w:noProof/>
                 <w:webHidden/>
               </w:rPr>
-              <w:instrText xml:space="preserve"> PAGEREF _Toc222066114 \h </w:instrText>
+              <w:instrText xml:space="preserve"> PAGEREF _Toc222231064 \h </w:instrText>
             </w:r>
             <w:r>
               <w:rPr>
@@ -649,7 +649,7 @@
                 <w:noProof/>
                 <w:webHidden/>
               </w:rPr>
-              <w:t>5</w:t>
+              <w:t>6</w:t>
             </w:r>
             <w:r>
               <w:rPr>
@@ -674,7 +674,7 @@
               <w:lang w:val="pl-PL" w:eastAsia="pl-PL"/>
             </w:rPr>
           </w:pPr>
-          <w:hyperlink w:anchor="_Toc222066115" w:history="1">
+          <w:hyperlink w:anchor="_Toc222231065" w:history="1">
             <w:r>
               <w:rPr>
                 <w:rStyle w:val="Hyperlink"/>
@@ -717,7 +717,7 @@
                 <w:noProof/>
                 <w:webHidden/>
               </w:rPr>
-              <w:instrText xml:space="preserve"> PAGEREF _Toc222066115 \h </w:instrText>
+              <w:instrText xml:space="preserve"> PAGEREF _Toc222231065 \h </w:instrText>
             </w:r>
             <w:r>
               <w:rPr>
@@ -737,7 +737,7 @@
                 <w:noProof/>
                 <w:webHidden/>
               </w:rPr>
-              <w:t>6</w:t>
+              <w:t>7</w:t>
             </w:r>
             <w:r>
               <w:rPr>
@@ -762,7 +762,7 @@
               <w:lang w:val="pl-PL" w:eastAsia="pl-PL"/>
             </w:rPr>
           </w:pPr>
-          <w:hyperlink w:anchor="_Toc222066116" w:history="1">
+          <w:hyperlink w:anchor="_Toc222231066" w:history="1">
             <w:r>
               <w:rPr>
                 <w:rStyle w:val="Hyperlink"/>
@@ -786,7 +786,7 @@
                 <w:noProof/>
                 <w:lang w:val="pl-PL"/>
               </w:rPr>
-              <w:t>Requirements</w:t>
+              <w:t>System requirements</w:t>
             </w:r>
             <w:r>
               <w:rPr>
@@ -807,7 +807,7 @@
                 <w:noProof/>
                 <w:webHidden/>
               </w:rPr>
-              <w:instrText xml:space="preserve"> PAGEREF _Toc222066116 \h </w:instrText>
+              <w:instrText xml:space="preserve"> PAGEREF _Toc222231066 \h </w:instrText>
             </w:r>
             <w:r>
               <w:rPr>
@@ -827,7 +827,889 @@
                 <w:noProof/>
                 <w:webHidden/>
               </w:rPr>
-              <w:t>7</w:t>
+              <w:t>8</w:t>
+            </w:r>
+            <w:r>
+              <w:rPr>
+                <w:noProof/>
+                <w:webHidden/>
+              </w:rPr>
+              <w:fldChar w:fldCharType="end"/>
+            </w:r>
+          </w:hyperlink>
+        </w:p>
+        <w:p>
+          <w:pPr>
+            <w:pStyle w:val="TOC2"/>
+            <w:tabs>
+              <w:tab w:val="left" w:pos="960"/>
+              <w:tab w:val="right" w:leader="dot" w:pos="9061"/>
+            </w:tabs>
+            <w:rPr>
+              <w:rFonts w:eastAsiaTheme="minorEastAsia"/>
+              <w:noProof/>
+              <w:szCs w:val="24"/>
+              <w:lang w:val="pl-PL" w:eastAsia="pl-PL"/>
+            </w:rPr>
+          </w:pPr>
+          <w:hyperlink w:anchor="_Toc222231067" w:history="1">
+            <w:r>
+              <w:rPr>
+                <w:rStyle w:val="Hyperlink"/>
+                <w:noProof/>
+                <w:lang w:val="pl-PL"/>
+              </w:rPr>
+              <w:t>3.1.</w:t>
+            </w:r>
+            <w:r>
+              <w:rPr>
+                <w:rFonts w:eastAsiaTheme="minorEastAsia"/>
+                <w:noProof/>
+                <w:szCs w:val="24"/>
+                <w:lang w:val="pl-PL" w:eastAsia="pl-PL"/>
+              </w:rPr>
+              <w:tab/>
+            </w:r>
+            <w:r>
+              <w:rPr>
+                <w:rStyle w:val="Hyperlink"/>
+                <w:noProof/>
+                <w:lang w:val="pl-PL"/>
+              </w:rPr>
+              <w:t>Fuctional requirements</w:t>
+            </w:r>
+            <w:r>
+              <w:rPr>
+                <w:noProof/>
+                <w:webHidden/>
+              </w:rPr>
+              <w:tab/>
+            </w:r>
+            <w:r>
+              <w:rPr>
+                <w:noProof/>
+                <w:webHidden/>
+              </w:rPr>
+              <w:fldChar w:fldCharType="begin"/>
+            </w:r>
+            <w:r>
+              <w:rPr>
+                <w:noProof/>
+                <w:webHidden/>
+              </w:rPr>
+              <w:instrText xml:space="preserve"> PAGEREF _Toc222231067 \h </w:instrText>
+            </w:r>
+            <w:r>
+              <w:rPr>
+                <w:noProof/>
+                <w:webHidden/>
+              </w:rPr>
+            </w:r>
+            <w:r>
+              <w:rPr>
+                <w:noProof/>
+                <w:webHidden/>
+              </w:rPr>
+              <w:fldChar w:fldCharType="separate"/>
+            </w:r>
+            <w:r>
+              <w:rPr>
+                <w:noProof/>
+                <w:webHidden/>
+              </w:rPr>
+              <w:t>8</w:t>
+            </w:r>
+            <w:r>
+              <w:rPr>
+                <w:noProof/>
+                <w:webHidden/>
+              </w:rPr>
+              <w:fldChar w:fldCharType="end"/>
+            </w:r>
+          </w:hyperlink>
+        </w:p>
+        <w:p>
+          <w:pPr>
+            <w:pStyle w:val="TOC3"/>
+            <w:tabs>
+              <w:tab w:val="left" w:pos="1440"/>
+              <w:tab w:val="right" w:leader="dot" w:pos="9061"/>
+            </w:tabs>
+            <w:rPr>
+              <w:rFonts w:eastAsiaTheme="minorEastAsia"/>
+              <w:noProof/>
+              <w:szCs w:val="24"/>
+              <w:lang w:val="pl-PL" w:eastAsia="pl-PL"/>
+            </w:rPr>
+          </w:pPr>
+          <w:hyperlink w:anchor="_Toc222231068" w:history="1">
+            <w:r>
+              <w:rPr>
+                <w:rStyle w:val="Hyperlink"/>
+                <w:noProof/>
+              </w:rPr>
+              <w:t>3.1.1.</w:t>
+            </w:r>
+            <w:r>
+              <w:rPr>
+                <w:rFonts w:eastAsiaTheme="minorEastAsia"/>
+                <w:noProof/>
+                <w:szCs w:val="24"/>
+                <w:lang w:val="pl-PL" w:eastAsia="pl-PL"/>
+              </w:rPr>
+              <w:tab/>
+            </w:r>
+            <w:r>
+              <w:rPr>
+                <w:rStyle w:val="Hyperlink"/>
+                <w:noProof/>
+              </w:rPr>
+              <w:t>User account management</w:t>
+            </w:r>
+            <w:r>
+              <w:rPr>
+                <w:noProof/>
+                <w:webHidden/>
+              </w:rPr>
+              <w:tab/>
+            </w:r>
+            <w:r>
+              <w:rPr>
+                <w:noProof/>
+                <w:webHidden/>
+              </w:rPr>
+              <w:fldChar w:fldCharType="begin"/>
+            </w:r>
+            <w:r>
+              <w:rPr>
+                <w:noProof/>
+                <w:webHidden/>
+              </w:rPr>
+              <w:instrText xml:space="preserve"> PAGEREF _Toc222231068 \h </w:instrText>
+            </w:r>
+            <w:r>
+              <w:rPr>
+                <w:noProof/>
+                <w:webHidden/>
+              </w:rPr>
+            </w:r>
+            <w:r>
+              <w:rPr>
+                <w:noProof/>
+                <w:webHidden/>
+              </w:rPr>
+              <w:fldChar w:fldCharType="separate"/>
+            </w:r>
+            <w:r>
+              <w:rPr>
+                <w:noProof/>
+                <w:webHidden/>
+              </w:rPr>
+              <w:t>8</w:t>
+            </w:r>
+            <w:r>
+              <w:rPr>
+                <w:noProof/>
+                <w:webHidden/>
+              </w:rPr>
+              <w:fldChar w:fldCharType="end"/>
+            </w:r>
+          </w:hyperlink>
+        </w:p>
+        <w:p>
+          <w:pPr>
+            <w:pStyle w:val="TOC3"/>
+            <w:tabs>
+              <w:tab w:val="left" w:pos="1440"/>
+              <w:tab w:val="right" w:leader="dot" w:pos="9061"/>
+            </w:tabs>
+            <w:rPr>
+              <w:rFonts w:eastAsiaTheme="minorEastAsia"/>
+              <w:noProof/>
+              <w:szCs w:val="24"/>
+              <w:lang w:val="pl-PL" w:eastAsia="pl-PL"/>
+            </w:rPr>
+          </w:pPr>
+          <w:hyperlink w:anchor="_Toc222231069" w:history="1">
+            <w:r>
+              <w:rPr>
+                <w:rStyle w:val="Hyperlink"/>
+                <w:noProof/>
+              </w:rPr>
+              <w:t>3.1.2.</w:t>
+            </w:r>
+            <w:r>
+              <w:rPr>
+                <w:rFonts w:eastAsiaTheme="minorEastAsia"/>
+                <w:noProof/>
+                <w:szCs w:val="24"/>
+                <w:lang w:val="pl-PL" w:eastAsia="pl-PL"/>
+              </w:rPr>
+              <w:tab/>
+            </w:r>
+            <w:r>
+              <w:rPr>
+                <w:rStyle w:val="Hyperlink"/>
+                <w:noProof/>
+              </w:rPr>
+              <w:t>Group management</w:t>
+            </w:r>
+            <w:r>
+              <w:rPr>
+                <w:noProof/>
+                <w:webHidden/>
+              </w:rPr>
+              <w:tab/>
+            </w:r>
+            <w:r>
+              <w:rPr>
+                <w:noProof/>
+                <w:webHidden/>
+              </w:rPr>
+              <w:fldChar w:fldCharType="begin"/>
+            </w:r>
+            <w:r>
+              <w:rPr>
+                <w:noProof/>
+                <w:webHidden/>
+              </w:rPr>
+              <w:instrText xml:space="preserve"> PAGEREF _Toc222231069 \h </w:instrText>
+            </w:r>
+            <w:r>
+              <w:rPr>
+                <w:noProof/>
+                <w:webHidden/>
+              </w:rPr>
+            </w:r>
+            <w:r>
+              <w:rPr>
+                <w:noProof/>
+                <w:webHidden/>
+              </w:rPr>
+              <w:fldChar w:fldCharType="separate"/>
+            </w:r>
+            <w:r>
+              <w:rPr>
+                <w:noProof/>
+                <w:webHidden/>
+              </w:rPr>
+              <w:t>8</w:t>
+            </w:r>
+            <w:r>
+              <w:rPr>
+                <w:noProof/>
+                <w:webHidden/>
+              </w:rPr>
+              <w:fldChar w:fldCharType="end"/>
+            </w:r>
+          </w:hyperlink>
+        </w:p>
+        <w:p>
+          <w:pPr>
+            <w:pStyle w:val="TOC2"/>
+            <w:tabs>
+              <w:tab w:val="left" w:pos="960"/>
+              <w:tab w:val="right" w:leader="dot" w:pos="9061"/>
+            </w:tabs>
+            <w:rPr>
+              <w:rFonts w:eastAsiaTheme="minorEastAsia"/>
+              <w:noProof/>
+              <w:szCs w:val="24"/>
+              <w:lang w:val="pl-PL" w:eastAsia="pl-PL"/>
+            </w:rPr>
+          </w:pPr>
+          <w:hyperlink w:anchor="_Toc222231070" w:history="1">
+            <w:r>
+              <w:rPr>
+                <w:rStyle w:val="Hyperlink"/>
+                <w:noProof/>
+              </w:rPr>
+              <w:t>3.2.</w:t>
+            </w:r>
+            <w:r>
+              <w:rPr>
+                <w:rFonts w:eastAsiaTheme="minorEastAsia"/>
+                <w:noProof/>
+                <w:szCs w:val="24"/>
+                <w:lang w:val="pl-PL" w:eastAsia="pl-PL"/>
+              </w:rPr>
+              <w:tab/>
+            </w:r>
+            <w:r>
+              <w:rPr>
+                <w:rStyle w:val="Hyperlink"/>
+                <w:noProof/>
+              </w:rPr>
+              <w:t>Non-functional requirements</w:t>
+            </w:r>
+            <w:r>
+              <w:rPr>
+                <w:noProof/>
+                <w:webHidden/>
+              </w:rPr>
+              <w:tab/>
+            </w:r>
+            <w:r>
+              <w:rPr>
+                <w:noProof/>
+                <w:webHidden/>
+              </w:rPr>
+              <w:fldChar w:fldCharType="begin"/>
+            </w:r>
+            <w:r>
+              <w:rPr>
+                <w:noProof/>
+                <w:webHidden/>
+              </w:rPr>
+              <w:instrText xml:space="preserve"> PAGEREF _Toc222231070 \h </w:instrText>
+            </w:r>
+            <w:r>
+              <w:rPr>
+                <w:noProof/>
+                <w:webHidden/>
+              </w:rPr>
+            </w:r>
+            <w:r>
+              <w:rPr>
+                <w:noProof/>
+                <w:webHidden/>
+              </w:rPr>
+              <w:fldChar w:fldCharType="separate"/>
+            </w:r>
+            <w:r>
+              <w:rPr>
+                <w:noProof/>
+                <w:webHidden/>
+              </w:rPr>
+              <w:t>8</w:t>
+            </w:r>
+            <w:r>
+              <w:rPr>
+                <w:noProof/>
+                <w:webHidden/>
+              </w:rPr>
+              <w:fldChar w:fldCharType="end"/>
+            </w:r>
+          </w:hyperlink>
+        </w:p>
+        <w:p>
+          <w:pPr>
+            <w:pStyle w:val="TOC3"/>
+            <w:tabs>
+              <w:tab w:val="left" w:pos="1440"/>
+              <w:tab w:val="right" w:leader="dot" w:pos="9061"/>
+            </w:tabs>
+            <w:rPr>
+              <w:rFonts w:eastAsiaTheme="minorEastAsia"/>
+              <w:noProof/>
+              <w:szCs w:val="24"/>
+              <w:lang w:val="pl-PL" w:eastAsia="pl-PL"/>
+            </w:rPr>
+          </w:pPr>
+          <w:hyperlink w:anchor="_Toc222231071" w:history="1">
+            <w:r>
+              <w:rPr>
+                <w:rStyle w:val="Hyperlink"/>
+                <w:noProof/>
+              </w:rPr>
+              <w:t>3.2.1.</w:t>
+            </w:r>
+            <w:r>
+              <w:rPr>
+                <w:rFonts w:eastAsiaTheme="minorEastAsia"/>
+                <w:noProof/>
+                <w:szCs w:val="24"/>
+                <w:lang w:val="pl-PL" w:eastAsia="pl-PL"/>
+              </w:rPr>
+              <w:tab/>
+            </w:r>
+            <w:r>
+              <w:rPr>
+                <w:rStyle w:val="Hyperlink"/>
+                <w:noProof/>
+              </w:rPr>
+              <w:t>Security</w:t>
+            </w:r>
+            <w:r>
+              <w:rPr>
+                <w:noProof/>
+                <w:webHidden/>
+              </w:rPr>
+              <w:tab/>
+            </w:r>
+            <w:r>
+              <w:rPr>
+                <w:noProof/>
+                <w:webHidden/>
+              </w:rPr>
+              <w:fldChar w:fldCharType="begin"/>
+            </w:r>
+            <w:r>
+              <w:rPr>
+                <w:noProof/>
+                <w:webHidden/>
+              </w:rPr>
+              <w:instrText xml:space="preserve"> PAGEREF _Toc222231071 \h </w:instrText>
+            </w:r>
+            <w:r>
+              <w:rPr>
+                <w:noProof/>
+                <w:webHidden/>
+              </w:rPr>
+            </w:r>
+            <w:r>
+              <w:rPr>
+                <w:noProof/>
+                <w:webHidden/>
+              </w:rPr>
+              <w:fldChar w:fldCharType="separate"/>
+            </w:r>
+            <w:r>
+              <w:rPr>
+                <w:noProof/>
+                <w:webHidden/>
+              </w:rPr>
+              <w:t>8</w:t>
+            </w:r>
+            <w:r>
+              <w:rPr>
+                <w:noProof/>
+                <w:webHidden/>
+              </w:rPr>
+              <w:fldChar w:fldCharType="end"/>
+            </w:r>
+          </w:hyperlink>
+        </w:p>
+        <w:p>
+          <w:pPr>
+            <w:pStyle w:val="TOC3"/>
+            <w:tabs>
+              <w:tab w:val="left" w:pos="1440"/>
+              <w:tab w:val="right" w:leader="dot" w:pos="9061"/>
+            </w:tabs>
+            <w:rPr>
+              <w:rFonts w:eastAsiaTheme="minorEastAsia"/>
+              <w:noProof/>
+              <w:szCs w:val="24"/>
+              <w:lang w:val="pl-PL" w:eastAsia="pl-PL"/>
+            </w:rPr>
+          </w:pPr>
+          <w:hyperlink w:anchor="_Toc222231072" w:history="1">
+            <w:r>
+              <w:rPr>
+                <w:rStyle w:val="Hyperlink"/>
+                <w:noProof/>
+              </w:rPr>
+              <w:t>3.2.2.</w:t>
+            </w:r>
+            <w:r>
+              <w:rPr>
+                <w:rFonts w:eastAsiaTheme="minorEastAsia"/>
+                <w:noProof/>
+                <w:szCs w:val="24"/>
+                <w:lang w:val="pl-PL" w:eastAsia="pl-PL"/>
+              </w:rPr>
+              <w:tab/>
+            </w:r>
+            <w:r>
+              <w:rPr>
+                <w:rStyle w:val="Hyperlink"/>
+                <w:noProof/>
+              </w:rPr>
+              <w:t>Performance</w:t>
+            </w:r>
+            <w:r>
+              <w:rPr>
+                <w:noProof/>
+                <w:webHidden/>
+              </w:rPr>
+              <w:tab/>
+            </w:r>
+            <w:r>
+              <w:rPr>
+                <w:noProof/>
+                <w:webHidden/>
+              </w:rPr>
+              <w:fldChar w:fldCharType="begin"/>
+            </w:r>
+            <w:r>
+              <w:rPr>
+                <w:noProof/>
+                <w:webHidden/>
+              </w:rPr>
+              <w:instrText xml:space="preserve"> PAGEREF _Toc222231072 \h </w:instrText>
+            </w:r>
+            <w:r>
+              <w:rPr>
+                <w:noProof/>
+                <w:webHidden/>
+              </w:rPr>
+            </w:r>
+            <w:r>
+              <w:rPr>
+                <w:noProof/>
+                <w:webHidden/>
+              </w:rPr>
+              <w:fldChar w:fldCharType="separate"/>
+            </w:r>
+            <w:r>
+              <w:rPr>
+                <w:noProof/>
+                <w:webHidden/>
+              </w:rPr>
+              <w:t>8</w:t>
+            </w:r>
+            <w:r>
+              <w:rPr>
+                <w:noProof/>
+                <w:webHidden/>
+              </w:rPr>
+              <w:fldChar w:fldCharType="end"/>
+            </w:r>
+          </w:hyperlink>
+        </w:p>
+        <w:p>
+          <w:pPr>
+            <w:pStyle w:val="TOC3"/>
+            <w:tabs>
+              <w:tab w:val="left" w:pos="1440"/>
+              <w:tab w:val="right" w:leader="dot" w:pos="9061"/>
+            </w:tabs>
+            <w:rPr>
+              <w:rFonts w:eastAsiaTheme="minorEastAsia"/>
+              <w:noProof/>
+              <w:szCs w:val="24"/>
+              <w:lang w:val="pl-PL" w:eastAsia="pl-PL"/>
+            </w:rPr>
+          </w:pPr>
+          <w:hyperlink w:anchor="_Toc222231073" w:history="1">
+            <w:r>
+              <w:rPr>
+                <w:rStyle w:val="Hyperlink"/>
+                <w:noProof/>
+              </w:rPr>
+              <w:t>3.2.3.</w:t>
+            </w:r>
+            <w:r>
+              <w:rPr>
+                <w:rFonts w:eastAsiaTheme="minorEastAsia"/>
+                <w:noProof/>
+                <w:szCs w:val="24"/>
+                <w:lang w:val="pl-PL" w:eastAsia="pl-PL"/>
+              </w:rPr>
+              <w:tab/>
+            </w:r>
+            <w:r>
+              <w:rPr>
+                <w:rStyle w:val="Hyperlink"/>
+                <w:noProof/>
+              </w:rPr>
+              <w:t>Reliability</w:t>
+            </w:r>
+            <w:r>
+              <w:rPr>
+                <w:noProof/>
+                <w:webHidden/>
+              </w:rPr>
+              <w:tab/>
+            </w:r>
+            <w:r>
+              <w:rPr>
+                <w:noProof/>
+                <w:webHidden/>
+              </w:rPr>
+              <w:fldChar w:fldCharType="begin"/>
+            </w:r>
+            <w:r>
+              <w:rPr>
+                <w:noProof/>
+                <w:webHidden/>
+              </w:rPr>
+              <w:instrText xml:space="preserve"> PAGEREF _Toc222231073 \h </w:instrText>
+            </w:r>
+            <w:r>
+              <w:rPr>
+                <w:noProof/>
+                <w:webHidden/>
+              </w:rPr>
+            </w:r>
+            <w:r>
+              <w:rPr>
+                <w:noProof/>
+                <w:webHidden/>
+              </w:rPr>
+              <w:fldChar w:fldCharType="separate"/>
+            </w:r>
+            <w:r>
+              <w:rPr>
+                <w:noProof/>
+                <w:webHidden/>
+              </w:rPr>
+              <w:t>8</w:t>
+            </w:r>
+            <w:r>
+              <w:rPr>
+                <w:noProof/>
+                <w:webHidden/>
+              </w:rPr>
+              <w:fldChar w:fldCharType="end"/>
+            </w:r>
+          </w:hyperlink>
+        </w:p>
+        <w:p>
+          <w:pPr>
+            <w:pStyle w:val="TOC3"/>
+            <w:tabs>
+              <w:tab w:val="left" w:pos="1440"/>
+              <w:tab w:val="right" w:leader="dot" w:pos="9061"/>
+            </w:tabs>
+            <w:rPr>
+              <w:rFonts w:eastAsiaTheme="minorEastAsia"/>
+              <w:noProof/>
+              <w:szCs w:val="24"/>
+              <w:lang w:val="pl-PL" w:eastAsia="pl-PL"/>
+            </w:rPr>
+          </w:pPr>
+          <w:hyperlink w:anchor="_Toc222231074" w:history="1">
+            <w:r>
+              <w:rPr>
+                <w:rStyle w:val="Hyperlink"/>
+                <w:noProof/>
+              </w:rPr>
+              <w:t>3.2.4.</w:t>
+            </w:r>
+            <w:r>
+              <w:rPr>
+                <w:rFonts w:eastAsiaTheme="minorEastAsia"/>
+                <w:noProof/>
+                <w:szCs w:val="24"/>
+                <w:lang w:val="pl-PL" w:eastAsia="pl-PL"/>
+              </w:rPr>
+              <w:tab/>
+            </w:r>
+            <w:r>
+              <w:rPr>
+                <w:rStyle w:val="Hyperlink"/>
+                <w:noProof/>
+              </w:rPr>
+              <w:t>Usability</w:t>
+            </w:r>
+            <w:r>
+              <w:rPr>
+                <w:noProof/>
+                <w:webHidden/>
+              </w:rPr>
+              <w:tab/>
+            </w:r>
+            <w:r>
+              <w:rPr>
+                <w:noProof/>
+                <w:webHidden/>
+              </w:rPr>
+              <w:fldChar w:fldCharType="begin"/>
+            </w:r>
+            <w:r>
+              <w:rPr>
+                <w:noProof/>
+                <w:webHidden/>
+              </w:rPr>
+              <w:instrText xml:space="preserve"> PAGEREF _Toc222231074 \h </w:instrText>
+            </w:r>
+            <w:r>
+              <w:rPr>
+                <w:noProof/>
+                <w:webHidden/>
+              </w:rPr>
+            </w:r>
+            <w:r>
+              <w:rPr>
+                <w:noProof/>
+                <w:webHidden/>
+              </w:rPr>
+              <w:fldChar w:fldCharType="separate"/>
+            </w:r>
+            <w:r>
+              <w:rPr>
+                <w:noProof/>
+                <w:webHidden/>
+              </w:rPr>
+              <w:t>8</w:t>
+            </w:r>
+            <w:r>
+              <w:rPr>
+                <w:noProof/>
+                <w:webHidden/>
+              </w:rPr>
+              <w:fldChar w:fldCharType="end"/>
+            </w:r>
+          </w:hyperlink>
+        </w:p>
+        <w:p>
+          <w:pPr>
+            <w:pStyle w:val="TOC3"/>
+            <w:tabs>
+              <w:tab w:val="left" w:pos="1440"/>
+              <w:tab w:val="right" w:leader="dot" w:pos="9061"/>
+            </w:tabs>
+            <w:rPr>
+              <w:rFonts w:eastAsiaTheme="minorEastAsia"/>
+              <w:noProof/>
+              <w:szCs w:val="24"/>
+              <w:lang w:val="pl-PL" w:eastAsia="pl-PL"/>
+            </w:rPr>
+          </w:pPr>
+          <w:hyperlink w:anchor="_Toc222231075" w:history="1">
+            <w:r>
+              <w:rPr>
+                <w:rStyle w:val="Hyperlink"/>
+                <w:noProof/>
+              </w:rPr>
+              <w:t>3.2.5.</w:t>
+            </w:r>
+            <w:r>
+              <w:rPr>
+                <w:rFonts w:eastAsiaTheme="minorEastAsia"/>
+                <w:noProof/>
+                <w:szCs w:val="24"/>
+                <w:lang w:val="pl-PL" w:eastAsia="pl-PL"/>
+              </w:rPr>
+              <w:tab/>
+            </w:r>
+            <w:r>
+              <w:rPr>
+                <w:rStyle w:val="Hyperlink"/>
+                <w:noProof/>
+              </w:rPr>
+              <w:t>Scalability</w:t>
+            </w:r>
+            <w:r>
+              <w:rPr>
+                <w:noProof/>
+                <w:webHidden/>
+              </w:rPr>
+              <w:tab/>
+            </w:r>
+            <w:r>
+              <w:rPr>
+                <w:noProof/>
+                <w:webHidden/>
+              </w:rPr>
+              <w:fldChar w:fldCharType="begin"/>
+            </w:r>
+            <w:r>
+              <w:rPr>
+                <w:noProof/>
+                <w:webHidden/>
+              </w:rPr>
+              <w:instrText xml:space="preserve"> PAGEREF _Toc222231075 \h </w:instrText>
+            </w:r>
+            <w:r>
+              <w:rPr>
+                <w:noProof/>
+                <w:webHidden/>
+              </w:rPr>
+            </w:r>
+            <w:r>
+              <w:rPr>
+                <w:noProof/>
+                <w:webHidden/>
+              </w:rPr>
+              <w:fldChar w:fldCharType="separate"/>
+            </w:r>
+            <w:r>
+              <w:rPr>
+                <w:noProof/>
+                <w:webHidden/>
+              </w:rPr>
+              <w:t>8</w:t>
+            </w:r>
+            <w:r>
+              <w:rPr>
+                <w:noProof/>
+                <w:webHidden/>
+              </w:rPr>
+              <w:fldChar w:fldCharType="end"/>
+            </w:r>
+          </w:hyperlink>
+        </w:p>
+        <w:p>
+          <w:pPr>
+            <w:pStyle w:val="TOC3"/>
+            <w:tabs>
+              <w:tab w:val="left" w:pos="1440"/>
+              <w:tab w:val="right" w:leader="dot" w:pos="9061"/>
+            </w:tabs>
+            <w:rPr>
+              <w:rFonts w:eastAsiaTheme="minorEastAsia"/>
+              <w:noProof/>
+              <w:szCs w:val="24"/>
+              <w:lang w:val="pl-PL" w:eastAsia="pl-PL"/>
+            </w:rPr>
+          </w:pPr>
+          <w:hyperlink w:anchor="_Toc222231076" w:history="1">
+            <w:r>
+              <w:rPr>
+                <w:rStyle w:val="Hyperlink"/>
+                <w:noProof/>
+              </w:rPr>
+              <w:t>3.2.6.</w:t>
+            </w:r>
+            <w:r>
+              <w:rPr>
+                <w:rFonts w:eastAsiaTheme="minorEastAsia"/>
+                <w:noProof/>
+                <w:szCs w:val="24"/>
+                <w:lang w:val="pl-PL" w:eastAsia="pl-PL"/>
+              </w:rPr>
+              <w:tab/>
+            </w:r>
+            <w:r>
+              <w:rPr>
+                <w:rStyle w:val="Hyperlink"/>
+                <w:noProof/>
+              </w:rPr>
+              <w:t>Compatibility</w:t>
+            </w:r>
+            <w:r>
+              <w:rPr>
+                <w:noProof/>
+                <w:webHidden/>
+              </w:rPr>
+              <w:tab/>
+            </w:r>
+            <w:r>
+              <w:rPr>
+                <w:noProof/>
+                <w:webHidden/>
+              </w:rPr>
+              <w:fldChar w:fldCharType="begin"/>
+            </w:r>
+            <w:r>
+              <w:rPr>
+                <w:noProof/>
+                <w:webHidden/>
+              </w:rPr>
+              <w:instrText xml:space="preserve"> PAGEREF _Toc222231076 \h </w:instrText>
+            </w:r>
+            <w:r>
+              <w:rPr>
+                <w:noProof/>
+                <w:webHidden/>
+              </w:rPr>
+            </w:r>
+            <w:r>
+              <w:rPr>
+                <w:noProof/>
+                <w:webHidden/>
+              </w:rPr>
+              <w:fldChar w:fldCharType="separate"/>
+            </w:r>
+            <w:r>
+              <w:rPr>
+                <w:noProof/>
+                <w:webHidden/>
+              </w:rPr>
+              <w:t>9</w:t>
             </w:r>
             <w:r>
               <w:rPr>
@@ -852,7 +1734,7 @@
               <w:lang w:val="pl-PL" w:eastAsia="pl-PL"/>
             </w:rPr>
           </w:pPr>
-          <w:hyperlink w:anchor="_Toc222066117" w:history="1">
+          <w:hyperlink w:anchor="_Toc222231077" w:history="1">
             <w:r>
               <w:rPr>
                 <w:rStyle w:val="Hyperlink"/>
@@ -897,7 +1779,7 @@
                 <w:noProof/>
                 <w:webHidden/>
               </w:rPr>
-              <w:instrText xml:space="preserve"> PAGEREF _Toc222066117 \h </w:instrText>
+              <w:instrText xml:space="preserve"> PAGEREF _Toc222231077 \h </w:instrText>
             </w:r>
             <w:r>
               <w:rPr>
@@ -917,7 +1799,7 @@
                 <w:noProof/>
                 <w:webHidden/>
               </w:rPr>
-              <w:t>8</w:t>
+              <w:t>10</w:t>
             </w:r>
             <w:r>
               <w:rPr>
@@ -942,7 +1824,7 @@
               <w:lang w:val="pl-PL" w:eastAsia="pl-PL"/>
             </w:rPr>
           </w:pPr>
-          <w:hyperlink w:anchor="_Toc222066118" w:history="1">
+          <w:hyperlink w:anchor="_Toc222231078" w:history="1">
             <w:r>
               <w:rPr>
                 <w:rStyle w:val="Hyperlink"/>
@@ -987,7 +1869,7 @@
                 <w:noProof/>
                 <w:webHidden/>
               </w:rPr>
-              <w:instrText xml:space="preserve"> PAGEREF _Toc222066118 \h </w:instrText>
+              <w:instrText xml:space="preserve"> PAGEREF _Toc222231078 \h </w:instrText>
             </w:r>
             <w:r>
               <w:rPr>
@@ -1007,7 +1889,7 @@
                 <w:noProof/>
                 <w:webHidden/>
               </w:rPr>
-              <w:t>8</w:t>
+              <w:t>10</w:t>
             </w:r>
             <w:r>
               <w:rPr>
@@ -1032,7 +1914,7 @@
               <w:lang w:val="pl-PL" w:eastAsia="pl-PL"/>
             </w:rPr>
           </w:pPr>
-          <w:hyperlink w:anchor="_Toc222066119" w:history="1">
+          <w:hyperlink w:anchor="_Toc222231079" w:history="1">
             <w:r>
               <w:rPr>
                 <w:rStyle w:val="Hyperlink"/>
@@ -1075,7 +1957,7 @@
                 <w:noProof/>
                 <w:webHidden/>
               </w:rPr>
-              <w:instrText xml:space="preserve"> PAGEREF _Toc222066119 \h </w:instrText>
+              <w:instrText xml:space="preserve"> PAGEREF _Toc222231079 \h </w:instrText>
             </w:r>
             <w:r>
               <w:rPr>
@@ -1095,7 +1977,7 @@
                 <w:noProof/>
                 <w:webHidden/>
               </w:rPr>
-              <w:t>8</w:t>
+              <w:t>10</w:t>
             </w:r>
             <w:r>
               <w:rPr>
@@ -1120,7 +2002,7 @@
               <w:lang w:val="pl-PL" w:eastAsia="pl-PL"/>
             </w:rPr>
           </w:pPr>
-          <w:hyperlink w:anchor="_Toc222066120" w:history="1">
+          <w:hyperlink w:anchor="_Toc222231080" w:history="1">
             <w:r>
               <w:rPr>
                 <w:rStyle w:val="Hyperlink"/>
@@ -1163,7 +2045,7 @@
                 <w:noProof/>
                 <w:webHidden/>
               </w:rPr>
-              <w:instrText xml:space="preserve"> PAGEREF _Toc222066120 \h </w:instrText>
+              <w:instrText xml:space="preserve"> PAGEREF _Toc222231080 \h </w:instrText>
             </w:r>
             <w:r>
               <w:rPr>
@@ -1183,7 +2065,7 @@
                 <w:noProof/>
                 <w:webHidden/>
               </w:rPr>
-              <w:t>8</w:t>
+              <w:t>10</w:t>
             </w:r>
             <w:r>
               <w:rPr>
@@ -1208,7 +2090,7 @@
               <w:lang w:val="pl-PL" w:eastAsia="pl-PL"/>
             </w:rPr>
           </w:pPr>
-          <w:hyperlink w:anchor="_Toc222066121" w:history="1">
+          <w:hyperlink w:anchor="_Toc222231081" w:history="1">
             <w:r>
               <w:rPr>
                 <w:rStyle w:val="Hyperlink"/>
@@ -1251,7 +2133,7 @@
                 <w:noProof/>
                 <w:webHidden/>
               </w:rPr>
-              <w:instrText xml:space="preserve"> PAGEREF _Toc222066121 \h </w:instrText>
+              <w:instrText xml:space="preserve"> PAGEREF _Toc222231081 \h </w:instrText>
             </w:r>
             <w:r>
               <w:rPr>
@@ -1271,7 +2153,7 @@
                 <w:noProof/>
                 <w:webHidden/>
               </w:rPr>
-              <w:t>9</w:t>
+              <w:t>11</w:t>
             </w:r>
             <w:r>
               <w:rPr>
@@ -1296,7 +2178,7 @@
               <w:lang w:val="pl-PL" w:eastAsia="pl-PL"/>
             </w:rPr>
           </w:pPr>
-          <w:hyperlink w:anchor="_Toc222066122" w:history="1">
+          <w:hyperlink w:anchor="_Toc222231082" w:history="1">
             <w:r>
               <w:rPr>
                 <w:rStyle w:val="Hyperlink"/>
@@ -1339,7 +2221,7 @@
                 <w:noProof/>
                 <w:webHidden/>
               </w:rPr>
-              <w:instrText xml:space="preserve"> PAGEREF _Toc222066122 \h </w:instrText>
+              <w:instrText xml:space="preserve"> PAGEREF _Toc222231082 \h </w:instrText>
             </w:r>
             <w:r>
               <w:rPr>
@@ -1359,7 +2241,7 @@
                 <w:noProof/>
                 <w:webHidden/>
               </w:rPr>
-              <w:t>9</w:t>
+              <w:t>11</w:t>
             </w:r>
             <w:r>
               <w:rPr>
@@ -1384,7 +2266,7 @@
               <w:lang w:val="pl-PL" w:eastAsia="pl-PL"/>
             </w:rPr>
           </w:pPr>
-          <w:hyperlink w:anchor="_Toc222066123" w:history="1">
+          <w:hyperlink w:anchor="_Toc222231083" w:history="1">
             <w:r>
               <w:rPr>
                 <w:rStyle w:val="Hyperlink"/>
@@ -1429,7 +2311,7 @@
                 <w:noProof/>
                 <w:webHidden/>
               </w:rPr>
-              <w:instrText xml:space="preserve"> PAGEREF _Toc222066123 \h </w:instrText>
+              <w:instrText xml:space="preserve"> PAGEREF _Toc222231083 \h </w:instrText>
             </w:r>
             <w:r>
               <w:rPr>
@@ -1449,7 +2331,7 @@
                 <w:noProof/>
                 <w:webHidden/>
               </w:rPr>
-              <w:t>9</w:t>
+              <w:t>12</w:t>
             </w:r>
             <w:r>
               <w:rPr>
@@ -1474,7 +2356,7 @@
               <w:lang w:val="pl-PL" w:eastAsia="pl-PL"/>
             </w:rPr>
           </w:pPr>
-          <w:hyperlink w:anchor="_Toc222066124" w:history="1">
+          <w:hyperlink w:anchor="_Toc222231084" w:history="1">
             <w:r>
               <w:rPr>
                 <w:rStyle w:val="Hyperlink"/>
@@ -1498,7 +2380,7 @@
                 <w:noProof/>
                 <w:lang w:val="pl-PL"/>
               </w:rPr>
-              <w:t>Database diagram</w:t>
+              <w:t>Architectural Overwiew</w:t>
             </w:r>
             <w:r>
               <w:rPr>
@@ -1519,7 +2401,7 @@
                 <w:noProof/>
                 <w:webHidden/>
               </w:rPr>
-              <w:instrText xml:space="preserve"> PAGEREF _Toc222066124 \h </w:instrText>
+              <w:instrText xml:space="preserve"> PAGEREF _Toc222231084 \h </w:instrText>
             </w:r>
             <w:r>
               <w:rPr>
@@ -1539,7 +2421,7 @@
                 <w:noProof/>
                 <w:webHidden/>
               </w:rPr>
-              <w:t>9</w:t>
+              <w:t>12</w:t>
             </w:r>
             <w:r>
               <w:rPr>
@@ -1564,7 +2446,7 @@
               <w:lang w:val="pl-PL" w:eastAsia="pl-PL"/>
             </w:rPr>
           </w:pPr>
-          <w:hyperlink w:anchor="_Toc222066125" w:history="1">
+          <w:hyperlink w:anchor="_Toc222231085" w:history="1">
             <w:r>
               <w:rPr>
                 <w:rStyle w:val="Hyperlink"/>
@@ -1588,7 +2470,7 @@
                 <w:noProof/>
                 <w:lang w:val="pl-PL"/>
               </w:rPr>
-              <w:t>Backend</w:t>
+              <w:t>Backend Architecture</w:t>
             </w:r>
             <w:r>
               <w:rPr>
@@ -1609,7 +2491,7 @@
                 <w:noProof/>
                 <w:webHidden/>
               </w:rPr>
-              <w:instrText xml:space="preserve"> PAGEREF _Toc222066125 \h </w:instrText>
+              <w:instrText xml:space="preserve"> PAGEREF _Toc222231085 \h </w:instrText>
             </w:r>
             <w:r>
               <w:rPr>
@@ -1629,7 +2511,7 @@
                 <w:noProof/>
                 <w:webHidden/>
               </w:rPr>
-              <w:t>9</w:t>
+              <w:t>12</w:t>
             </w:r>
             <w:r>
               <w:rPr>
@@ -1654,7 +2536,7 @@
               <w:lang w:val="pl-PL" w:eastAsia="pl-PL"/>
             </w:rPr>
           </w:pPr>
-          <w:hyperlink w:anchor="_Toc222066126" w:history="1">
+          <w:hyperlink w:anchor="_Toc222231086" w:history="1">
             <w:r>
               <w:rPr>
                 <w:rStyle w:val="Hyperlink"/>
@@ -1678,7 +2560,7 @@
                 <w:noProof/>
                 <w:lang w:val="pl-PL"/>
               </w:rPr>
-              <w:t>Frontend</w:t>
+              <w:t>Database Architecture</w:t>
             </w:r>
             <w:r>
               <w:rPr>
@@ -1699,7 +2581,7 @@
                 <w:noProof/>
                 <w:webHidden/>
               </w:rPr>
-              <w:instrText xml:space="preserve"> PAGEREF _Toc222066126 \h </w:instrText>
+              <w:instrText xml:space="preserve"> PAGEREF _Toc222231086 \h </w:instrText>
             </w:r>
             <w:r>
               <w:rPr>
@@ -1719,7 +2601,187 @@
                 <w:noProof/>
                 <w:webHidden/>
               </w:rPr>
-              <w:t>10</w:t>
+              <w:t>12</w:t>
+            </w:r>
+            <w:r>
+              <w:rPr>
+                <w:noProof/>
+                <w:webHidden/>
+              </w:rPr>
+              <w:fldChar w:fldCharType="end"/>
+            </w:r>
+          </w:hyperlink>
+        </w:p>
+        <w:p>
+          <w:pPr>
+            <w:pStyle w:val="TOC2"/>
+            <w:tabs>
+              <w:tab w:val="left" w:pos="960"/>
+              <w:tab w:val="right" w:leader="dot" w:pos="9061"/>
+            </w:tabs>
+            <w:rPr>
+              <w:rFonts w:eastAsiaTheme="minorEastAsia"/>
+              <w:noProof/>
+              <w:szCs w:val="24"/>
+              <w:lang w:val="pl-PL" w:eastAsia="pl-PL"/>
+            </w:rPr>
+          </w:pPr>
+          <w:hyperlink w:anchor="_Toc222231087" w:history="1">
+            <w:r>
+              <w:rPr>
+                <w:rStyle w:val="Hyperlink"/>
+                <w:noProof/>
+                <w:lang w:val="pl-PL"/>
+              </w:rPr>
+              <w:t>5.4.</w:t>
+            </w:r>
+            <w:r>
+              <w:rPr>
+                <w:rFonts w:eastAsiaTheme="minorEastAsia"/>
+                <w:noProof/>
+                <w:szCs w:val="24"/>
+                <w:lang w:val="pl-PL" w:eastAsia="pl-PL"/>
+              </w:rPr>
+              <w:tab/>
+            </w:r>
+            <w:r>
+              <w:rPr>
+                <w:rStyle w:val="Hyperlink"/>
+                <w:noProof/>
+                <w:lang w:val="pl-PL"/>
+              </w:rPr>
+              <w:t>Security Architecture</w:t>
+            </w:r>
+            <w:r>
+              <w:rPr>
+                <w:noProof/>
+                <w:webHidden/>
+              </w:rPr>
+              <w:tab/>
+            </w:r>
+            <w:r>
+              <w:rPr>
+                <w:noProof/>
+                <w:webHidden/>
+              </w:rPr>
+              <w:fldChar w:fldCharType="begin"/>
+            </w:r>
+            <w:r>
+              <w:rPr>
+                <w:noProof/>
+                <w:webHidden/>
+              </w:rPr>
+              <w:instrText xml:space="preserve"> PAGEREF _Toc222231087 \h </w:instrText>
+            </w:r>
+            <w:r>
+              <w:rPr>
+                <w:noProof/>
+                <w:webHidden/>
+              </w:rPr>
+            </w:r>
+            <w:r>
+              <w:rPr>
+                <w:noProof/>
+                <w:webHidden/>
+              </w:rPr>
+              <w:fldChar w:fldCharType="separate"/>
+            </w:r>
+            <w:r>
+              <w:rPr>
+                <w:noProof/>
+                <w:webHidden/>
+              </w:rPr>
+              <w:t>12</w:t>
+            </w:r>
+            <w:r>
+              <w:rPr>
+                <w:noProof/>
+                <w:webHidden/>
+              </w:rPr>
+              <w:fldChar w:fldCharType="end"/>
+            </w:r>
+          </w:hyperlink>
+        </w:p>
+        <w:p>
+          <w:pPr>
+            <w:pStyle w:val="TOC2"/>
+            <w:tabs>
+              <w:tab w:val="left" w:pos="960"/>
+              <w:tab w:val="right" w:leader="dot" w:pos="9061"/>
+            </w:tabs>
+            <w:rPr>
+              <w:rFonts w:eastAsiaTheme="minorEastAsia"/>
+              <w:noProof/>
+              <w:szCs w:val="24"/>
+              <w:lang w:val="pl-PL" w:eastAsia="pl-PL"/>
+            </w:rPr>
+          </w:pPr>
+          <w:hyperlink w:anchor="_Toc222231088" w:history="1">
+            <w:r>
+              <w:rPr>
+                <w:rStyle w:val="Hyperlink"/>
+                <w:noProof/>
+                <w:lang w:val="pl-PL"/>
+              </w:rPr>
+              <w:t>5.5.</w:t>
+            </w:r>
+            <w:r>
+              <w:rPr>
+                <w:rFonts w:eastAsiaTheme="minorEastAsia"/>
+                <w:noProof/>
+                <w:szCs w:val="24"/>
+                <w:lang w:val="pl-PL" w:eastAsia="pl-PL"/>
+              </w:rPr>
+              <w:tab/>
+            </w:r>
+            <w:r>
+              <w:rPr>
+                <w:rStyle w:val="Hyperlink"/>
+                <w:noProof/>
+                <w:lang w:val="pl-PL"/>
+              </w:rPr>
+              <w:t>Frontend Architecture</w:t>
+            </w:r>
+            <w:r>
+              <w:rPr>
+                <w:noProof/>
+                <w:webHidden/>
+              </w:rPr>
+              <w:tab/>
+            </w:r>
+            <w:r>
+              <w:rPr>
+                <w:noProof/>
+                <w:webHidden/>
+              </w:rPr>
+              <w:fldChar w:fldCharType="begin"/>
+            </w:r>
+            <w:r>
+              <w:rPr>
+                <w:noProof/>
+                <w:webHidden/>
+              </w:rPr>
+              <w:instrText xml:space="preserve"> PAGEREF _Toc222231088 \h </w:instrText>
+            </w:r>
+            <w:r>
+              <w:rPr>
+                <w:noProof/>
+                <w:webHidden/>
+              </w:rPr>
+            </w:r>
+            <w:r>
+              <w:rPr>
+                <w:noProof/>
+                <w:webHidden/>
+              </w:rPr>
+              <w:fldChar w:fldCharType="separate"/>
+            </w:r>
+            <w:r>
+              <w:rPr>
+                <w:noProof/>
+                <w:webHidden/>
+              </w:rPr>
+              <w:t>12</w:t>
             </w:r>
             <w:r>
               <w:rPr>
@@ -1744,7 +2806,7 @@
               <w:lang w:val="pl-PL" w:eastAsia="pl-PL"/>
             </w:rPr>
           </w:pPr>
-          <w:hyperlink w:anchor="_Toc222066127" w:history="1">
+          <w:hyperlink w:anchor="_Toc222231089" w:history="1">
             <w:r>
               <w:rPr>
                 <w:rStyle w:val="Hyperlink"/>
@@ -1768,7 +2830,7 @@
                 <w:noProof/>
                 <w:lang w:val="pl-PL"/>
               </w:rPr>
-              <w:t>Implementation</w:t>
+              <w:t>System implementation</w:t>
             </w:r>
             <w:r>
               <w:rPr>
@@ -1789,7 +2851,7 @@
                 <w:noProof/>
                 <w:webHidden/>
               </w:rPr>
-              <w:instrText xml:space="preserve"> PAGEREF _Toc222066127 \h </w:instrText>
+              <w:instrText xml:space="preserve"> PAGEREF _Toc222231089 \h </w:instrText>
             </w:r>
             <w:r>
               <w:rPr>
@@ -1809,7 +2871,1171 @@
                 <w:noProof/>
                 <w:webHidden/>
               </w:rPr>
-              <w:t>11</w:t>
+              <w:t>13</w:t>
+            </w:r>
+            <w:r>
+              <w:rPr>
+                <w:noProof/>
+                <w:webHidden/>
+              </w:rPr>
+              <w:fldChar w:fldCharType="end"/>
+            </w:r>
+          </w:hyperlink>
+        </w:p>
+        <w:p>
+          <w:pPr>
+            <w:pStyle w:val="TOC2"/>
+            <w:tabs>
+              <w:tab w:val="left" w:pos="960"/>
+              <w:tab w:val="right" w:leader="dot" w:pos="9061"/>
+            </w:tabs>
+            <w:rPr>
+              <w:rFonts w:eastAsiaTheme="minorEastAsia"/>
+              <w:noProof/>
+              <w:szCs w:val="24"/>
+              <w:lang w:val="pl-PL" w:eastAsia="pl-PL"/>
+            </w:rPr>
+          </w:pPr>
+          <w:hyperlink w:anchor="_Toc222231090" w:history="1">
+            <w:r>
+              <w:rPr>
+                <w:rStyle w:val="Hyperlink"/>
+                <w:noProof/>
+                <w:lang w:val="pl-PL"/>
+              </w:rPr>
+              <w:t>6.1.</w:t>
+            </w:r>
+            <w:r>
+              <w:rPr>
+                <w:rFonts w:eastAsiaTheme="minorEastAsia"/>
+                <w:noProof/>
+                <w:szCs w:val="24"/>
+                <w:lang w:val="pl-PL" w:eastAsia="pl-PL"/>
+              </w:rPr>
+              <w:tab/>
+            </w:r>
+            <w:r>
+              <w:rPr>
+                <w:rStyle w:val="Hyperlink"/>
+                <w:noProof/>
+                <w:lang w:val="pl-PL"/>
+              </w:rPr>
+              <w:t>Backend implementation</w:t>
+            </w:r>
+            <w:r>
+              <w:rPr>
+                <w:noProof/>
+                <w:webHidden/>
+              </w:rPr>
+              <w:tab/>
+            </w:r>
+            <w:r>
+              <w:rPr>
+                <w:noProof/>
+                <w:webHidden/>
+              </w:rPr>
+              <w:fldChar w:fldCharType="begin"/>
+            </w:r>
+            <w:r>
+              <w:rPr>
+                <w:noProof/>
+                <w:webHidden/>
+              </w:rPr>
+              <w:instrText xml:space="preserve"> PAGEREF _Toc222231090 \h </w:instrText>
+            </w:r>
+            <w:r>
+              <w:rPr>
+                <w:noProof/>
+                <w:webHidden/>
+              </w:rPr>
+            </w:r>
+            <w:r>
+              <w:rPr>
+                <w:noProof/>
+                <w:webHidden/>
+              </w:rPr>
+              <w:fldChar w:fldCharType="separate"/>
+            </w:r>
+            <w:r>
+              <w:rPr>
+                <w:noProof/>
+                <w:webHidden/>
+              </w:rPr>
+              <w:t>13</w:t>
+            </w:r>
+            <w:r>
+              <w:rPr>
+                <w:noProof/>
+                <w:webHidden/>
+              </w:rPr>
+              <w:fldChar w:fldCharType="end"/>
+            </w:r>
+          </w:hyperlink>
+        </w:p>
+        <w:p>
+          <w:pPr>
+            <w:pStyle w:val="TOC3"/>
+            <w:tabs>
+              <w:tab w:val="left" w:pos="1440"/>
+              <w:tab w:val="right" w:leader="dot" w:pos="9061"/>
+            </w:tabs>
+            <w:rPr>
+              <w:rFonts w:eastAsiaTheme="minorEastAsia"/>
+              <w:noProof/>
+              <w:szCs w:val="24"/>
+              <w:lang w:val="pl-PL" w:eastAsia="pl-PL"/>
+            </w:rPr>
+          </w:pPr>
+          <w:hyperlink w:anchor="_Toc222231091" w:history="1">
+            <w:r>
+              <w:rPr>
+                <w:rStyle w:val="Hyperlink"/>
+                <w:noProof/>
+                <w:lang w:val="pl-PL"/>
+              </w:rPr>
+              <w:t>6.1.1.</w:t>
+            </w:r>
+            <w:r>
+              <w:rPr>
+                <w:rFonts w:eastAsiaTheme="minorEastAsia"/>
+                <w:noProof/>
+                <w:szCs w:val="24"/>
+                <w:lang w:val="pl-PL" w:eastAsia="pl-PL"/>
+              </w:rPr>
+              <w:tab/>
+            </w:r>
+            <w:r>
+              <w:rPr>
+                <w:rStyle w:val="Hyperlink"/>
+                <w:noProof/>
+                <w:lang w:val="pl-PL"/>
+              </w:rPr>
+              <w:t>Structure</w:t>
+            </w:r>
+            <w:r>
+              <w:rPr>
+                <w:noProof/>
+                <w:webHidden/>
+              </w:rPr>
+              <w:tab/>
+            </w:r>
+            <w:r>
+              <w:rPr>
+                <w:noProof/>
+                <w:webHidden/>
+              </w:rPr>
+              <w:fldChar w:fldCharType="begin"/>
+            </w:r>
+            <w:r>
+              <w:rPr>
+                <w:noProof/>
+                <w:webHidden/>
+              </w:rPr>
+              <w:instrText xml:space="preserve"> PAGEREF _Toc222231091 \h </w:instrText>
+            </w:r>
+            <w:r>
+              <w:rPr>
+                <w:noProof/>
+                <w:webHidden/>
+              </w:rPr>
+            </w:r>
+            <w:r>
+              <w:rPr>
+                <w:noProof/>
+                <w:webHidden/>
+              </w:rPr>
+              <w:fldChar w:fldCharType="separate"/>
+            </w:r>
+            <w:r>
+              <w:rPr>
+                <w:noProof/>
+                <w:webHidden/>
+              </w:rPr>
+              <w:t>13</w:t>
+            </w:r>
+            <w:r>
+              <w:rPr>
+                <w:noProof/>
+                <w:webHidden/>
+              </w:rPr>
+              <w:fldChar w:fldCharType="end"/>
+            </w:r>
+          </w:hyperlink>
+        </w:p>
+        <w:p>
+          <w:pPr>
+            <w:pStyle w:val="TOC3"/>
+            <w:tabs>
+              <w:tab w:val="left" w:pos="1440"/>
+              <w:tab w:val="right" w:leader="dot" w:pos="9061"/>
+            </w:tabs>
+            <w:rPr>
+              <w:rFonts w:eastAsiaTheme="minorEastAsia"/>
+              <w:noProof/>
+              <w:szCs w:val="24"/>
+              <w:lang w:val="pl-PL" w:eastAsia="pl-PL"/>
+            </w:rPr>
+          </w:pPr>
+          <w:hyperlink w:anchor="_Toc222231092" w:history="1">
+            <w:r>
+              <w:rPr>
+                <w:rStyle w:val="Hyperlink"/>
+                <w:noProof/>
+                <w:lang w:val="pl-PL"/>
+              </w:rPr>
+              <w:t>6.1.2.</w:t>
+            </w:r>
+            <w:r>
+              <w:rPr>
+                <w:rFonts w:eastAsiaTheme="minorEastAsia"/>
+                <w:noProof/>
+                <w:szCs w:val="24"/>
+                <w:lang w:val="pl-PL" w:eastAsia="pl-PL"/>
+              </w:rPr>
+              <w:tab/>
+            </w:r>
+            <w:r>
+              <w:rPr>
+                <w:rStyle w:val="Hyperlink"/>
+                <w:noProof/>
+                <w:lang w:val="pl-PL"/>
+              </w:rPr>
+              <w:t>API endpoints</w:t>
+            </w:r>
+            <w:r>
+              <w:rPr>
+                <w:noProof/>
+                <w:webHidden/>
+              </w:rPr>
+              <w:tab/>
+            </w:r>
+            <w:r>
+              <w:rPr>
+                <w:noProof/>
+                <w:webHidden/>
+              </w:rPr>
+              <w:fldChar w:fldCharType="begin"/>
+            </w:r>
+            <w:r>
+              <w:rPr>
+                <w:noProof/>
+                <w:webHidden/>
+              </w:rPr>
+              <w:instrText xml:space="preserve"> PAGEREF _Toc222231092 \h </w:instrText>
+            </w:r>
+            <w:r>
+              <w:rPr>
+                <w:noProof/>
+                <w:webHidden/>
+              </w:rPr>
+            </w:r>
+            <w:r>
+              <w:rPr>
+                <w:noProof/>
+                <w:webHidden/>
+              </w:rPr>
+              <w:fldChar w:fldCharType="separate"/>
+            </w:r>
+            <w:r>
+              <w:rPr>
+                <w:noProof/>
+                <w:webHidden/>
+              </w:rPr>
+              <w:t>13</w:t>
+            </w:r>
+            <w:r>
+              <w:rPr>
+                <w:noProof/>
+                <w:webHidden/>
+              </w:rPr>
+              <w:fldChar w:fldCharType="end"/>
+            </w:r>
+          </w:hyperlink>
+        </w:p>
+        <w:p>
+          <w:pPr>
+            <w:pStyle w:val="TOC3"/>
+            <w:tabs>
+              <w:tab w:val="left" w:pos="1440"/>
+              <w:tab w:val="right" w:leader="dot" w:pos="9061"/>
+            </w:tabs>
+            <w:rPr>
+              <w:rFonts w:eastAsiaTheme="minorEastAsia"/>
+              <w:noProof/>
+              <w:szCs w:val="24"/>
+              <w:lang w:val="pl-PL" w:eastAsia="pl-PL"/>
+            </w:rPr>
+          </w:pPr>
+          <w:hyperlink w:anchor="_Toc222231093" w:history="1">
+            <w:r>
+              <w:rPr>
+                <w:rStyle w:val="Hyperlink"/>
+                <w:noProof/>
+              </w:rPr>
+              <w:t>6.1.3.</w:t>
+            </w:r>
+            <w:r>
+              <w:rPr>
+                <w:rFonts w:eastAsiaTheme="minorEastAsia"/>
+                <w:noProof/>
+                <w:szCs w:val="24"/>
+                <w:lang w:val="pl-PL" w:eastAsia="pl-PL"/>
+              </w:rPr>
+              <w:tab/>
+            </w:r>
+            <w:r>
+              <w:rPr>
+                <w:rStyle w:val="Hyperlink"/>
+                <w:noProof/>
+              </w:rPr>
+              <w:t>Business logic layer</w:t>
+            </w:r>
+            <w:r>
+              <w:rPr>
+                <w:noProof/>
+                <w:webHidden/>
+              </w:rPr>
+              <w:tab/>
+            </w:r>
+            <w:r>
+              <w:rPr>
+                <w:noProof/>
+                <w:webHidden/>
+              </w:rPr>
+              <w:fldChar w:fldCharType="begin"/>
+            </w:r>
+            <w:r>
+              <w:rPr>
+                <w:noProof/>
+                <w:webHidden/>
+              </w:rPr>
+              <w:instrText xml:space="preserve"> PAGEREF _Toc222231093 \h </w:instrText>
+            </w:r>
+            <w:r>
+              <w:rPr>
+                <w:noProof/>
+                <w:webHidden/>
+              </w:rPr>
+            </w:r>
+            <w:r>
+              <w:rPr>
+                <w:noProof/>
+                <w:webHidden/>
+              </w:rPr>
+              <w:fldChar w:fldCharType="separate"/>
+            </w:r>
+            <w:r>
+              <w:rPr>
+                <w:noProof/>
+                <w:webHidden/>
+              </w:rPr>
+              <w:t>13</w:t>
+            </w:r>
+            <w:r>
+              <w:rPr>
+                <w:noProof/>
+                <w:webHidden/>
+              </w:rPr>
+              <w:fldChar w:fldCharType="end"/>
+            </w:r>
+          </w:hyperlink>
+        </w:p>
+        <w:p>
+          <w:pPr>
+            <w:pStyle w:val="TOC3"/>
+            <w:tabs>
+              <w:tab w:val="left" w:pos="1440"/>
+              <w:tab w:val="right" w:leader="dot" w:pos="9061"/>
+            </w:tabs>
+            <w:rPr>
+              <w:rFonts w:eastAsiaTheme="minorEastAsia"/>
+              <w:noProof/>
+              <w:szCs w:val="24"/>
+              <w:lang w:val="pl-PL" w:eastAsia="pl-PL"/>
+            </w:rPr>
+          </w:pPr>
+          <w:hyperlink w:anchor="_Toc222231094" w:history="1">
+            <w:r>
+              <w:rPr>
+                <w:rStyle w:val="Hyperlink"/>
+                <w:noProof/>
+              </w:rPr>
+              <w:t>6.1.4.</w:t>
+            </w:r>
+            <w:r>
+              <w:rPr>
+                <w:rFonts w:eastAsiaTheme="minorEastAsia"/>
+                <w:noProof/>
+                <w:szCs w:val="24"/>
+                <w:lang w:val="pl-PL" w:eastAsia="pl-PL"/>
+              </w:rPr>
+              <w:tab/>
+            </w:r>
+            <w:r>
+              <w:rPr>
+                <w:rStyle w:val="Hyperlink"/>
+                <w:noProof/>
+              </w:rPr>
+              <w:t>Data access layer</w:t>
+            </w:r>
+            <w:r>
+              <w:rPr>
+                <w:noProof/>
+                <w:webHidden/>
+              </w:rPr>
+              <w:tab/>
+            </w:r>
+            <w:r>
+              <w:rPr>
+                <w:noProof/>
+                <w:webHidden/>
+              </w:rPr>
+              <w:fldChar w:fldCharType="begin"/>
+            </w:r>
+            <w:r>
+              <w:rPr>
+                <w:noProof/>
+                <w:webHidden/>
+              </w:rPr>
+              <w:instrText xml:space="preserve"> PAGEREF _Toc222231094 \h </w:instrText>
+            </w:r>
+            <w:r>
+              <w:rPr>
+                <w:noProof/>
+                <w:webHidden/>
+              </w:rPr>
+            </w:r>
+            <w:r>
+              <w:rPr>
+                <w:noProof/>
+                <w:webHidden/>
+              </w:rPr>
+              <w:fldChar w:fldCharType="separate"/>
+            </w:r>
+            <w:r>
+              <w:rPr>
+                <w:noProof/>
+                <w:webHidden/>
+              </w:rPr>
+              <w:t>13</w:t>
+            </w:r>
+            <w:r>
+              <w:rPr>
+                <w:noProof/>
+                <w:webHidden/>
+              </w:rPr>
+              <w:fldChar w:fldCharType="end"/>
+            </w:r>
+          </w:hyperlink>
+        </w:p>
+        <w:p>
+          <w:pPr>
+            <w:pStyle w:val="TOC2"/>
+            <w:tabs>
+              <w:tab w:val="left" w:pos="960"/>
+              <w:tab w:val="right" w:leader="dot" w:pos="9061"/>
+            </w:tabs>
+            <w:rPr>
+              <w:rFonts w:eastAsiaTheme="minorEastAsia"/>
+              <w:noProof/>
+              <w:szCs w:val="24"/>
+              <w:lang w:val="pl-PL" w:eastAsia="pl-PL"/>
+            </w:rPr>
+          </w:pPr>
+          <w:hyperlink w:anchor="_Toc222231095" w:history="1">
+            <w:r>
+              <w:rPr>
+                <w:rStyle w:val="Hyperlink"/>
+                <w:noProof/>
+              </w:rPr>
+              <w:t>6.2.</w:t>
+            </w:r>
+            <w:r>
+              <w:rPr>
+                <w:rFonts w:eastAsiaTheme="minorEastAsia"/>
+                <w:noProof/>
+                <w:szCs w:val="24"/>
+                <w:lang w:val="pl-PL" w:eastAsia="pl-PL"/>
+              </w:rPr>
+              <w:tab/>
+            </w:r>
+            <w:r>
+              <w:rPr>
+                <w:rStyle w:val="Hyperlink"/>
+                <w:noProof/>
+              </w:rPr>
+              <w:t>Authentication and Authorization Implementation</w:t>
+            </w:r>
+            <w:r>
+              <w:rPr>
+                <w:noProof/>
+                <w:webHidden/>
+              </w:rPr>
+              <w:tab/>
+            </w:r>
+            <w:r>
+              <w:rPr>
+                <w:noProof/>
+                <w:webHidden/>
+              </w:rPr>
+              <w:fldChar w:fldCharType="begin"/>
+            </w:r>
+            <w:r>
+              <w:rPr>
+                <w:noProof/>
+                <w:webHidden/>
+              </w:rPr>
+              <w:instrText xml:space="preserve"> PAGEREF _Toc222231095 \h </w:instrText>
+            </w:r>
+            <w:r>
+              <w:rPr>
+                <w:noProof/>
+                <w:webHidden/>
+              </w:rPr>
+            </w:r>
+            <w:r>
+              <w:rPr>
+                <w:noProof/>
+                <w:webHidden/>
+              </w:rPr>
+              <w:fldChar w:fldCharType="separate"/>
+            </w:r>
+            <w:r>
+              <w:rPr>
+                <w:noProof/>
+                <w:webHidden/>
+              </w:rPr>
+              <w:t>13</w:t>
+            </w:r>
+            <w:r>
+              <w:rPr>
+                <w:noProof/>
+                <w:webHidden/>
+              </w:rPr>
+              <w:fldChar w:fldCharType="end"/>
+            </w:r>
+          </w:hyperlink>
+        </w:p>
+        <w:p>
+          <w:pPr>
+            <w:pStyle w:val="TOC3"/>
+            <w:tabs>
+              <w:tab w:val="left" w:pos="1440"/>
+              <w:tab w:val="right" w:leader="dot" w:pos="9061"/>
+            </w:tabs>
+            <w:rPr>
+              <w:rFonts w:eastAsiaTheme="minorEastAsia"/>
+              <w:noProof/>
+              <w:szCs w:val="24"/>
+              <w:lang w:val="pl-PL" w:eastAsia="pl-PL"/>
+            </w:rPr>
+          </w:pPr>
+          <w:hyperlink w:anchor="_Toc222231096" w:history="1">
+            <w:r>
+              <w:rPr>
+                <w:rStyle w:val="Hyperlink"/>
+                <w:noProof/>
+                <w:lang w:val="pl-PL"/>
+              </w:rPr>
+              <w:t>6.2.1.</w:t>
+            </w:r>
+            <w:r>
+              <w:rPr>
+                <w:rFonts w:eastAsiaTheme="minorEastAsia"/>
+                <w:noProof/>
+                <w:szCs w:val="24"/>
+                <w:lang w:val="pl-PL" w:eastAsia="pl-PL"/>
+              </w:rPr>
+              <w:tab/>
+            </w:r>
+            <w:r>
+              <w:rPr>
+                <w:rStyle w:val="Hyperlink"/>
+                <w:noProof/>
+                <w:lang w:val="pl-PL"/>
+              </w:rPr>
+              <w:t>JWT generation</w:t>
+            </w:r>
+            <w:r>
+              <w:rPr>
+                <w:noProof/>
+                <w:webHidden/>
+              </w:rPr>
+              <w:tab/>
+            </w:r>
+            <w:r>
+              <w:rPr>
+                <w:noProof/>
+                <w:webHidden/>
+              </w:rPr>
+              <w:fldChar w:fldCharType="begin"/>
+            </w:r>
+            <w:r>
+              <w:rPr>
+                <w:noProof/>
+                <w:webHidden/>
+              </w:rPr>
+              <w:instrText xml:space="preserve"> PAGEREF _Toc222231096 \h </w:instrText>
+            </w:r>
+            <w:r>
+              <w:rPr>
+                <w:noProof/>
+                <w:webHidden/>
+              </w:rPr>
+            </w:r>
+            <w:r>
+              <w:rPr>
+                <w:noProof/>
+                <w:webHidden/>
+              </w:rPr>
+              <w:fldChar w:fldCharType="separate"/>
+            </w:r>
+            <w:r>
+              <w:rPr>
+                <w:noProof/>
+                <w:webHidden/>
+              </w:rPr>
+              <w:t>13</w:t>
+            </w:r>
+            <w:r>
+              <w:rPr>
+                <w:noProof/>
+                <w:webHidden/>
+              </w:rPr>
+              <w:fldChar w:fldCharType="end"/>
+            </w:r>
+          </w:hyperlink>
+        </w:p>
+        <w:p>
+          <w:pPr>
+            <w:pStyle w:val="TOC3"/>
+            <w:tabs>
+              <w:tab w:val="left" w:pos="1440"/>
+              <w:tab w:val="right" w:leader="dot" w:pos="9061"/>
+            </w:tabs>
+            <w:rPr>
+              <w:rFonts w:eastAsiaTheme="minorEastAsia"/>
+              <w:noProof/>
+              <w:szCs w:val="24"/>
+              <w:lang w:val="pl-PL" w:eastAsia="pl-PL"/>
+            </w:rPr>
+          </w:pPr>
+          <w:hyperlink w:anchor="_Toc222231097" w:history="1">
+            <w:r>
+              <w:rPr>
+                <w:rStyle w:val="Hyperlink"/>
+                <w:noProof/>
+                <w:lang w:val="pl-PL"/>
+              </w:rPr>
+              <w:t>6.2.2.</w:t>
+            </w:r>
+            <w:r>
+              <w:rPr>
+                <w:rFonts w:eastAsiaTheme="minorEastAsia"/>
+                <w:noProof/>
+                <w:szCs w:val="24"/>
+                <w:lang w:val="pl-PL" w:eastAsia="pl-PL"/>
+              </w:rPr>
+              <w:tab/>
+            </w:r>
+            <w:r>
+              <w:rPr>
+                <w:rStyle w:val="Hyperlink"/>
+                <w:noProof/>
+                <w:lang w:val="pl-PL"/>
+              </w:rPr>
+              <w:t>Token verification</w:t>
+            </w:r>
+            <w:r>
+              <w:rPr>
+                <w:noProof/>
+                <w:webHidden/>
+              </w:rPr>
+              <w:tab/>
+            </w:r>
+            <w:r>
+              <w:rPr>
+                <w:noProof/>
+                <w:webHidden/>
+              </w:rPr>
+              <w:fldChar w:fldCharType="begin"/>
+            </w:r>
+            <w:r>
+              <w:rPr>
+                <w:noProof/>
+                <w:webHidden/>
+              </w:rPr>
+              <w:instrText xml:space="preserve"> PAGEREF _Toc222231097 \h </w:instrText>
+            </w:r>
+            <w:r>
+              <w:rPr>
+                <w:noProof/>
+                <w:webHidden/>
+              </w:rPr>
+            </w:r>
+            <w:r>
+              <w:rPr>
+                <w:noProof/>
+                <w:webHidden/>
+              </w:rPr>
+              <w:fldChar w:fldCharType="separate"/>
+            </w:r>
+            <w:r>
+              <w:rPr>
+                <w:noProof/>
+                <w:webHidden/>
+              </w:rPr>
+              <w:t>13</w:t>
+            </w:r>
+            <w:r>
+              <w:rPr>
+                <w:noProof/>
+                <w:webHidden/>
+              </w:rPr>
+              <w:fldChar w:fldCharType="end"/>
+            </w:r>
+          </w:hyperlink>
+        </w:p>
+        <w:p>
+          <w:pPr>
+            <w:pStyle w:val="TOC3"/>
+            <w:tabs>
+              <w:tab w:val="left" w:pos="1440"/>
+              <w:tab w:val="right" w:leader="dot" w:pos="9061"/>
+            </w:tabs>
+            <w:rPr>
+              <w:rFonts w:eastAsiaTheme="minorEastAsia"/>
+              <w:noProof/>
+              <w:szCs w:val="24"/>
+              <w:lang w:val="pl-PL" w:eastAsia="pl-PL"/>
+            </w:rPr>
+          </w:pPr>
+          <w:hyperlink w:anchor="_Toc222231098" w:history="1">
+            <w:r>
+              <w:rPr>
+                <w:rStyle w:val="Hyperlink"/>
+                <w:noProof/>
+                <w:lang w:val="pl-PL"/>
+              </w:rPr>
+              <w:t>6.2.3.</w:t>
+            </w:r>
+            <w:r>
+              <w:rPr>
+                <w:rFonts w:eastAsiaTheme="minorEastAsia"/>
+                <w:noProof/>
+                <w:szCs w:val="24"/>
+                <w:lang w:val="pl-PL" w:eastAsia="pl-PL"/>
+              </w:rPr>
+              <w:tab/>
+            </w:r>
+            <w:r>
+              <w:rPr>
+                <w:rStyle w:val="Hyperlink"/>
+                <w:noProof/>
+                <w:lang w:val="pl-PL"/>
+              </w:rPr>
+              <w:t>Dependency injection</w:t>
+            </w:r>
+            <w:r>
+              <w:rPr>
+                <w:noProof/>
+                <w:webHidden/>
+              </w:rPr>
+              <w:tab/>
+            </w:r>
+            <w:r>
+              <w:rPr>
+                <w:noProof/>
+                <w:webHidden/>
+              </w:rPr>
+              <w:fldChar w:fldCharType="begin"/>
+            </w:r>
+            <w:r>
+              <w:rPr>
+                <w:noProof/>
+                <w:webHidden/>
+              </w:rPr>
+              <w:instrText xml:space="preserve"> PAGEREF _Toc222231098 \h </w:instrText>
+            </w:r>
+            <w:r>
+              <w:rPr>
+                <w:noProof/>
+                <w:webHidden/>
+              </w:rPr>
+            </w:r>
+            <w:r>
+              <w:rPr>
+                <w:noProof/>
+                <w:webHidden/>
+              </w:rPr>
+              <w:fldChar w:fldCharType="separate"/>
+            </w:r>
+            <w:r>
+              <w:rPr>
+                <w:noProof/>
+                <w:webHidden/>
+              </w:rPr>
+              <w:t>13</w:t>
+            </w:r>
+            <w:r>
+              <w:rPr>
+                <w:noProof/>
+                <w:webHidden/>
+              </w:rPr>
+              <w:fldChar w:fldCharType="end"/>
+            </w:r>
+          </w:hyperlink>
+        </w:p>
+        <w:p>
+          <w:pPr>
+            <w:pStyle w:val="TOC2"/>
+            <w:tabs>
+              <w:tab w:val="left" w:pos="960"/>
+              <w:tab w:val="right" w:leader="dot" w:pos="9061"/>
+            </w:tabs>
+            <w:rPr>
+              <w:rFonts w:eastAsiaTheme="minorEastAsia"/>
+              <w:noProof/>
+              <w:szCs w:val="24"/>
+              <w:lang w:val="pl-PL" w:eastAsia="pl-PL"/>
+            </w:rPr>
+          </w:pPr>
+          <w:hyperlink w:anchor="_Toc222231099" w:history="1">
+            <w:r>
+              <w:rPr>
+                <w:rStyle w:val="Hyperlink"/>
+                <w:noProof/>
+                <w:lang w:val="pl-PL"/>
+              </w:rPr>
+              <w:t>6.3.</w:t>
+            </w:r>
+            <w:r>
+              <w:rPr>
+                <w:rFonts w:eastAsiaTheme="minorEastAsia"/>
+                <w:noProof/>
+                <w:szCs w:val="24"/>
+                <w:lang w:val="pl-PL" w:eastAsia="pl-PL"/>
+              </w:rPr>
+              <w:tab/>
+            </w:r>
+            <w:r>
+              <w:rPr>
+                <w:rStyle w:val="Hyperlink"/>
+                <w:noProof/>
+                <w:lang w:val="pl-PL"/>
+              </w:rPr>
+              <w:t>Frontend implementation</w:t>
+            </w:r>
+            <w:r>
+              <w:rPr>
+                <w:noProof/>
+                <w:webHidden/>
+              </w:rPr>
+              <w:tab/>
+            </w:r>
+            <w:r>
+              <w:rPr>
+                <w:noProof/>
+                <w:webHidden/>
+              </w:rPr>
+              <w:fldChar w:fldCharType="begin"/>
+            </w:r>
+            <w:r>
+              <w:rPr>
+                <w:noProof/>
+                <w:webHidden/>
+              </w:rPr>
+              <w:instrText xml:space="preserve"> PAGEREF _Toc222231099 \h </w:instrText>
+            </w:r>
+            <w:r>
+              <w:rPr>
+                <w:noProof/>
+                <w:webHidden/>
+              </w:rPr>
+            </w:r>
+            <w:r>
+              <w:rPr>
+                <w:noProof/>
+                <w:webHidden/>
+              </w:rPr>
+              <w:fldChar w:fldCharType="separate"/>
+            </w:r>
+            <w:r>
+              <w:rPr>
+                <w:noProof/>
+                <w:webHidden/>
+              </w:rPr>
+              <w:t>13</w:t>
+            </w:r>
+            <w:r>
+              <w:rPr>
+                <w:noProof/>
+                <w:webHidden/>
+              </w:rPr>
+              <w:fldChar w:fldCharType="end"/>
+            </w:r>
+          </w:hyperlink>
+        </w:p>
+        <w:p>
+          <w:pPr>
+            <w:pStyle w:val="TOC3"/>
+            <w:tabs>
+              <w:tab w:val="left" w:pos="1440"/>
+              <w:tab w:val="right" w:leader="dot" w:pos="9061"/>
+            </w:tabs>
+            <w:rPr>
+              <w:rFonts w:eastAsiaTheme="minorEastAsia"/>
+              <w:noProof/>
+              <w:szCs w:val="24"/>
+              <w:lang w:val="pl-PL" w:eastAsia="pl-PL"/>
+            </w:rPr>
+          </w:pPr>
+          <w:hyperlink w:anchor="_Toc222231100" w:history="1">
+            <w:r>
+              <w:rPr>
+                <w:rStyle w:val="Hyperlink"/>
+                <w:noProof/>
+                <w:lang w:val="pl-PL"/>
+              </w:rPr>
+              <w:t>6.3.1.</w:t>
+            </w:r>
+            <w:r>
+              <w:rPr>
+                <w:rFonts w:eastAsiaTheme="minorEastAsia"/>
+                <w:noProof/>
+                <w:szCs w:val="24"/>
+                <w:lang w:val="pl-PL" w:eastAsia="pl-PL"/>
+              </w:rPr>
+              <w:tab/>
+            </w:r>
+            <w:r>
+              <w:rPr>
+                <w:rStyle w:val="Hyperlink"/>
+                <w:noProof/>
+                <w:lang w:val="pl-PL"/>
+              </w:rPr>
+              <w:t>Structure</w:t>
+            </w:r>
+            <w:r>
+              <w:rPr>
+                <w:noProof/>
+                <w:webHidden/>
+              </w:rPr>
+              <w:tab/>
+            </w:r>
+            <w:r>
+              <w:rPr>
+                <w:noProof/>
+                <w:webHidden/>
+              </w:rPr>
+              <w:fldChar w:fldCharType="begin"/>
+            </w:r>
+            <w:r>
+              <w:rPr>
+                <w:noProof/>
+                <w:webHidden/>
+              </w:rPr>
+              <w:instrText xml:space="preserve"> PAGEREF _Toc222231100 \h </w:instrText>
+            </w:r>
+            <w:r>
+              <w:rPr>
+                <w:noProof/>
+                <w:webHidden/>
+              </w:rPr>
+            </w:r>
+            <w:r>
+              <w:rPr>
+                <w:noProof/>
+                <w:webHidden/>
+              </w:rPr>
+              <w:fldChar w:fldCharType="separate"/>
+            </w:r>
+            <w:r>
+              <w:rPr>
+                <w:noProof/>
+                <w:webHidden/>
+              </w:rPr>
+              <w:t>13</w:t>
+            </w:r>
+            <w:r>
+              <w:rPr>
+                <w:noProof/>
+                <w:webHidden/>
+              </w:rPr>
+              <w:fldChar w:fldCharType="end"/>
+            </w:r>
+          </w:hyperlink>
+        </w:p>
+        <w:p>
+          <w:pPr>
+            <w:pStyle w:val="TOC3"/>
+            <w:tabs>
+              <w:tab w:val="left" w:pos="1440"/>
+              <w:tab w:val="right" w:leader="dot" w:pos="9061"/>
+            </w:tabs>
+            <w:rPr>
+              <w:rFonts w:eastAsiaTheme="minorEastAsia"/>
+              <w:noProof/>
+              <w:szCs w:val="24"/>
+              <w:lang w:val="pl-PL" w:eastAsia="pl-PL"/>
+            </w:rPr>
+          </w:pPr>
+          <w:hyperlink w:anchor="_Toc222231101" w:history="1">
+            <w:r>
+              <w:rPr>
+                <w:rStyle w:val="Hyperlink"/>
+                <w:noProof/>
+                <w:lang w:val="pl-PL"/>
+              </w:rPr>
+              <w:t>6.3.2.</w:t>
+            </w:r>
+            <w:r>
+              <w:rPr>
+                <w:rFonts w:eastAsiaTheme="minorEastAsia"/>
+                <w:noProof/>
+                <w:szCs w:val="24"/>
+                <w:lang w:val="pl-PL" w:eastAsia="pl-PL"/>
+              </w:rPr>
+              <w:tab/>
+            </w:r>
+            <w:r>
+              <w:rPr>
+                <w:rStyle w:val="Hyperlink"/>
+                <w:noProof/>
+                <w:lang w:val="pl-PL"/>
+              </w:rPr>
+              <w:t>Authentication Handling</w:t>
+            </w:r>
+            <w:r>
+              <w:rPr>
+                <w:noProof/>
+                <w:webHidden/>
+              </w:rPr>
+              <w:tab/>
+            </w:r>
+            <w:r>
+              <w:rPr>
+                <w:noProof/>
+                <w:webHidden/>
+              </w:rPr>
+              <w:fldChar w:fldCharType="begin"/>
+            </w:r>
+            <w:r>
+              <w:rPr>
+                <w:noProof/>
+                <w:webHidden/>
+              </w:rPr>
+              <w:instrText xml:space="preserve"> PAGEREF _Toc222231101 \h </w:instrText>
+            </w:r>
+            <w:r>
+              <w:rPr>
+                <w:noProof/>
+                <w:webHidden/>
+              </w:rPr>
+            </w:r>
+            <w:r>
+              <w:rPr>
+                <w:noProof/>
+                <w:webHidden/>
+              </w:rPr>
+              <w:fldChar w:fldCharType="separate"/>
+            </w:r>
+            <w:r>
+              <w:rPr>
+                <w:noProof/>
+                <w:webHidden/>
+              </w:rPr>
+              <w:t>13</w:t>
+            </w:r>
+            <w:r>
+              <w:rPr>
+                <w:noProof/>
+                <w:webHidden/>
+              </w:rPr>
+              <w:fldChar w:fldCharType="end"/>
+            </w:r>
+          </w:hyperlink>
+        </w:p>
+        <w:p>
+          <w:pPr>
+            <w:pStyle w:val="TOC3"/>
+            <w:tabs>
+              <w:tab w:val="left" w:pos="1440"/>
+              <w:tab w:val="right" w:leader="dot" w:pos="9061"/>
+            </w:tabs>
+            <w:rPr>
+              <w:rFonts w:eastAsiaTheme="minorEastAsia"/>
+              <w:noProof/>
+              <w:szCs w:val="24"/>
+              <w:lang w:val="pl-PL" w:eastAsia="pl-PL"/>
+            </w:rPr>
+          </w:pPr>
+          <w:hyperlink w:anchor="_Toc222231102" w:history="1">
+            <w:r>
+              <w:rPr>
+                <w:rStyle w:val="Hyperlink"/>
+                <w:noProof/>
+                <w:lang w:val="pl-PL"/>
+              </w:rPr>
+              <w:t>6.3.3.</w:t>
+            </w:r>
+            <w:r>
+              <w:rPr>
+                <w:rFonts w:eastAsiaTheme="minorEastAsia"/>
+                <w:noProof/>
+                <w:szCs w:val="24"/>
+                <w:lang w:val="pl-PL" w:eastAsia="pl-PL"/>
+              </w:rPr>
+              <w:tab/>
+            </w:r>
+            <w:r>
+              <w:rPr>
+                <w:rStyle w:val="Hyperlink"/>
+                <w:noProof/>
+                <w:lang w:val="pl-PL"/>
+              </w:rPr>
+              <w:t>UI implementation</w:t>
+            </w:r>
+            <w:r>
+              <w:rPr>
+                <w:noProof/>
+                <w:webHidden/>
+              </w:rPr>
+              <w:tab/>
+            </w:r>
+            <w:r>
+              <w:rPr>
+                <w:noProof/>
+                <w:webHidden/>
+              </w:rPr>
+              <w:fldChar w:fldCharType="begin"/>
+            </w:r>
+            <w:r>
+              <w:rPr>
+                <w:noProof/>
+                <w:webHidden/>
+              </w:rPr>
+              <w:instrText xml:space="preserve"> PAGEREF _Toc222231102 \h </w:instrText>
+            </w:r>
+            <w:r>
+              <w:rPr>
+                <w:noProof/>
+                <w:webHidden/>
+              </w:rPr>
+            </w:r>
+            <w:r>
+              <w:rPr>
+                <w:noProof/>
+                <w:webHidden/>
+              </w:rPr>
+              <w:fldChar w:fldCharType="separate"/>
+            </w:r>
+            <w:r>
+              <w:rPr>
+                <w:noProof/>
+                <w:webHidden/>
+              </w:rPr>
+              <w:t>13</w:t>
             </w:r>
             <w:r>
               <w:rPr>
@@ -1834,7 +4060,7 @@
               <w:lang w:val="pl-PL" w:eastAsia="pl-PL"/>
             </w:rPr>
           </w:pPr>
-          <w:hyperlink w:anchor="_Toc222066128" w:history="1">
+          <w:hyperlink w:anchor="_Toc222231103" w:history="1">
             <w:r>
               <w:rPr>
                 <w:rStyle w:val="Hyperlink"/>
@@ -1879,7 +4105,7 @@
                 <w:noProof/>
                 <w:webHidden/>
               </w:rPr>
-              <w:instrText xml:space="preserve"> PAGEREF _Toc222066128 \h </w:instrText>
+              <w:instrText xml:space="preserve"> PAGEREF _Toc222231103 \h </w:instrText>
             </w:r>
             <w:r>
               <w:rPr>
@@ -1899,7 +4125,7 @@
                 <w:noProof/>
                 <w:webHidden/>
               </w:rPr>
-              <w:t>12</w:t>
+              <w:t>15</w:t>
             </w:r>
             <w:r>
               <w:rPr>
@@ -1924,7 +4150,7 @@
               <w:lang w:val="pl-PL" w:eastAsia="pl-PL"/>
             </w:rPr>
           </w:pPr>
-          <w:hyperlink w:anchor="_Toc222066129" w:history="1">
+          <w:hyperlink w:anchor="_Toc222231104" w:history="1">
             <w:r>
               <w:rPr>
                 <w:rStyle w:val="Hyperlink"/>
@@ -1969,7 +4195,7 @@
                 <w:noProof/>
                 <w:webHidden/>
               </w:rPr>
-              <w:instrText xml:space="preserve"> PAGEREF _Toc222066129 \h </w:instrText>
+              <w:instrText xml:space="preserve"> PAGEREF _Toc222231104 \h </w:instrText>
             </w:r>
             <w:r>
               <w:rPr>
@@ -1989,7 +4215,7 @@
                 <w:noProof/>
                 <w:webHidden/>
               </w:rPr>
-              <w:t>13</w:t>
+              <w:t>16</w:t>
             </w:r>
             <w:r>
               <w:rPr>
@@ -2014,7 +4240,7 @@
               <w:lang w:val="pl-PL" w:eastAsia="pl-PL"/>
             </w:rPr>
           </w:pPr>
-          <w:hyperlink w:anchor="_Toc222066130" w:history="1">
+          <w:hyperlink w:anchor="_Toc222231105" w:history="1">
             <w:r>
               <w:rPr>
                 <w:rStyle w:val="Hyperlink"/>
@@ -2059,7 +4285,7 @@
                 <w:noProof/>
                 <w:webHidden/>
               </w:rPr>
-              <w:instrText xml:space="preserve"> PAGEREF _Toc222066130 \h </w:instrText>
+              <w:instrText xml:space="preserve"> PAGEREF _Toc222231105 \h </w:instrText>
             </w:r>
             <w:r>
               <w:rPr>
@@ -2079,7 +4305,7 @@
                 <w:noProof/>
                 <w:webHidden/>
               </w:rPr>
-              <w:t>14</w:t>
+              <w:t>17</w:t>
             </w:r>
             <w:r>
               <w:rPr>
@@ -2124,7 +4350,7 @@
       <w:pPr>
         <w:pStyle w:val="Heading1"/>
       </w:pPr>
-      <w:bookmarkStart w:id="1" w:name="_Toc222066114"/>
+      <w:bookmarkStart w:id="1" w:name="_Toc222231064"/>
       <w:r>
         <w:lastRenderedPageBreak/>
         <w:t>Introduction</w:t>
@@ -2146,7 +4372,7 @@
       <w:pPr>
         <w:pStyle w:val="Heading1"/>
       </w:pPr>
-      <w:bookmarkStart w:id="2" w:name="_Toc222066115"/>
+      <w:bookmarkStart w:id="2" w:name="_Toc222231065"/>
       <w:r>
         <w:lastRenderedPageBreak/>
         <w:t>Existing solution</w:t>
@@ -2231,44 +4457,476 @@
         </w:rPr>
         <w:br w:type="page"/>
       </w:r>
-      <w:bookmarkStart w:id="3" w:name="_Toc222066116"/>
+      <w:bookmarkStart w:id="3" w:name="_Toc222231066"/>
       <w:r>
         <w:rPr>
           <w:lang w:val="pl-PL"/>
         </w:rPr>
         <w:lastRenderedPageBreak/>
-        <w:t>Requirements</w:t>
+        <w:t>System r</w:t>
+      </w:r>
+      <w:r>
+        <w:rPr>
+          <w:lang w:val="pl-PL"/>
+        </w:rPr>
+        <w:t>equirements</w:t>
       </w:r>
       <w:bookmarkEnd w:id="3"/>
-      <w:r>
-        <w:rPr>
-          <w:lang w:val="pl-PL"/>
-        </w:rPr>
+    </w:p>
+    <w:p>
+      <w:pPr>
+        <w:pStyle w:val="Heading2"/>
+        <w:rPr>
+          <w:lang w:val="pl-PL"/>
+        </w:rPr>
+      </w:pPr>
+      <w:bookmarkStart w:id="4" w:name="_Toc222231067"/>
+      <w:r>
+        <w:rPr>
+          <w:lang w:val="pl-PL"/>
+        </w:rPr>
+        <w:t>Fuctional requirements</w:t>
+      </w:r>
+      <w:bookmarkEnd w:id="4"/>
+    </w:p>
+    <w:p>
+      <w:r>
+        <w:t>Functional requirements describe the behavior of the system and the operations that the user can perform within it.</w:t>
+      </w:r>
+    </w:p>
+    <w:p>
+      <w:pPr>
+        <w:pStyle w:val="Heading3"/>
+      </w:pPr>
+      <w:bookmarkStart w:id="5" w:name="_Toc222231068"/>
+      <w:r>
+        <w:t xml:space="preserve">User </w:t>
+      </w:r>
+      <w:r>
+        <w:t>account management</w:t>
+      </w:r>
+      <w:bookmarkEnd w:id="5"/>
+    </w:p>
+    <w:p>
+      <w:pPr>
+        <w:pStyle w:val="ListParagraph"/>
+        <w:numPr>
+          <w:ilvl w:val="0"/>
+          <w:numId w:val="3"/>
+        </w:numPr>
+      </w:pPr>
+      <w:r>
+        <w:t>Users</w:t>
+      </w:r>
+      <w:r>
+        <w:t xml:space="preserve"> </w:t>
+      </w:r>
+      <w:r>
+        <w:t xml:space="preserve">can </w:t>
+      </w:r>
+      <w:r>
+        <w:t>register a new user using an email address and password</w:t>
+      </w:r>
+      <w:r>
+        <w:t>.</w:t>
+      </w:r>
+    </w:p>
+    <w:p>
+      <w:pPr>
+        <w:pStyle w:val="ListParagraph"/>
+        <w:numPr>
+          <w:ilvl w:val="0"/>
+          <w:numId w:val="3"/>
+        </w:numPr>
+      </w:pPr>
+      <w:r>
+        <w:t>U</w:t>
+      </w:r>
+      <w:r>
+        <w:t>ser</w:t>
+      </w:r>
+      <w:r>
+        <w:t>s</w:t>
+      </w:r>
+      <w:r>
+        <w:t xml:space="preserve"> </w:t>
+      </w:r>
+      <w:r>
+        <w:t xml:space="preserve">can </w:t>
+      </w:r>
+      <w:r>
+        <w:t>lo</w:t>
+      </w:r>
+      <w:r>
+        <w:t>g in using valid credentials</w:t>
+      </w:r>
+      <w:r>
+        <w:t>.</w:t>
+      </w:r>
+    </w:p>
+    <w:p>
+      <w:pPr>
+        <w:pStyle w:val="ListParagraph"/>
+        <w:numPr>
+          <w:ilvl w:val="0"/>
+          <w:numId w:val="3"/>
+        </w:numPr>
+      </w:pPr>
+      <w:r>
+        <w:t>Users can log out.</w:t>
+      </w:r>
+    </w:p>
+    <w:p>
+      <w:pPr>
+        <w:pStyle w:val="ListParagraph"/>
+        <w:numPr>
+          <w:ilvl w:val="0"/>
+          <w:numId w:val="3"/>
+        </w:numPr>
+      </w:pPr>
+      <w:r>
+        <w:t>Users are prevented from accessing protected resources</w:t>
+      </w:r>
+      <w:r>
+        <w:t>.</w:t>
+      </w:r>
+    </w:p>
+    <w:p>
+      <w:pPr>
+        <w:pStyle w:val="Heading3"/>
+      </w:pPr>
+      <w:bookmarkStart w:id="6" w:name="_Toc222231069"/>
+      <w:r>
+        <w:t>Group management</w:t>
+      </w:r>
+      <w:bookmarkEnd w:id="6"/>
+    </w:p>
+    <w:p>
+      <w:pPr>
+        <w:pStyle w:val="ListParagraph"/>
+        <w:numPr>
+          <w:ilvl w:val="0"/>
+          <w:numId w:val="4"/>
+        </w:numPr>
+      </w:pPr>
+      <w:r>
+        <w:t>Users can create a new expense group.</w:t>
+      </w:r>
+    </w:p>
+    <w:p>
+      <w:pPr>
+        <w:pStyle w:val="ListParagraph"/>
+        <w:numPr>
+          <w:ilvl w:val="0"/>
+          <w:numId w:val="4"/>
+        </w:numPr>
+      </w:pPr>
+      <w:r>
+        <w:t>Users can the list of group members.</w:t>
+      </w:r>
+    </w:p>
+    <w:p>
+      <w:pPr>
+        <w:pStyle w:val="ListParagraph"/>
+        <w:numPr>
+          <w:ilvl w:val="0"/>
+          <w:numId w:val="4"/>
+        </w:numPr>
+      </w:pPr>
+      <w:r>
+        <w:t>Group owners can invite other users.</w:t>
+      </w:r>
+    </w:p>
+    <w:p>
+      <w:pPr>
+        <w:pStyle w:val="ListParagraph"/>
+        <w:numPr>
+          <w:ilvl w:val="0"/>
+          <w:numId w:val="4"/>
+        </w:numPr>
+      </w:pPr>
+      <w:r>
+        <w:t>Group owners can remove users from the group.</w:t>
+      </w:r>
+    </w:p>
+    <w:p>
+      <w:pPr>
+        <w:pStyle w:val="ListParagraph"/>
+        <w:numPr>
+          <w:ilvl w:val="0"/>
+          <w:numId w:val="4"/>
+        </w:numPr>
+      </w:pPr>
+      <w:r>
+        <w:t>Group owners can delete a group.</w:t>
+      </w:r>
+    </w:p>
+    <w:p>
+      <w:pPr>
+        <w:pStyle w:val="Heading2"/>
+      </w:pPr>
+      <w:bookmarkStart w:id="7" w:name="_Toc222231070"/>
+      <w:r>
+        <w:t>Non-functional requirements</w:t>
+      </w:r>
+      <w:bookmarkEnd w:id="7"/>
+    </w:p>
+    <w:p>
+      <w:r>
+        <w:t>Non-functional requirements describe quality attributes and system constraints.</w:t>
+      </w:r>
+    </w:p>
+    <w:p>
+      <w:pPr>
+        <w:pStyle w:val="Heading3"/>
+      </w:pPr>
+      <w:bookmarkStart w:id="8" w:name="_Toc222231071"/>
+      <w:r>
+        <w:t>Security</w:t>
+      </w:r>
+      <w:bookmarkEnd w:id="8"/>
+    </w:p>
+    <w:p>
+      <w:pPr>
+        <w:pStyle w:val="ListParagraph"/>
+        <w:numPr>
+          <w:ilvl w:val="0"/>
+          <w:numId w:val="5"/>
+        </w:numPr>
+      </w:pPr>
+      <w:r>
+        <w:t>User passwords shall be stored in hashed form.</w:t>
+      </w:r>
+    </w:p>
+    <w:p>
+      <w:pPr>
+        <w:pStyle w:val="ListParagraph"/>
+        <w:numPr>
+          <w:ilvl w:val="0"/>
+          <w:numId w:val="5"/>
+        </w:numPr>
+      </w:pPr>
+      <w:r>
+        <w:t>System shall use JWT-based authentication.</w:t>
+      </w:r>
+    </w:p>
+    <w:p>
+      <w:pPr>
+        <w:pStyle w:val="ListParagraph"/>
+        <w:numPr>
+          <w:ilvl w:val="0"/>
+          <w:numId w:val="5"/>
+        </w:numPr>
+      </w:pPr>
+      <w:r>
+        <w:t>Communication between client and server shall use HTTPS.</w:t>
+      </w:r>
+    </w:p>
+    <w:p>
+      <w:pPr>
+        <w:pStyle w:val="ListParagraph"/>
+        <w:numPr>
+          <w:ilvl w:val="0"/>
+          <w:numId w:val="5"/>
+        </w:numPr>
+      </w:pPr>
+      <w:r>
+        <w:t>Access to resources shall be controlled based on authentication state.</w:t>
+      </w:r>
+    </w:p>
+    <w:p>
+      <w:pPr>
+        <w:pStyle w:val="Heading3"/>
+      </w:pPr>
+      <w:bookmarkStart w:id="9" w:name="_Toc222231072"/>
+      <w:r>
+        <w:t>Performance</w:t>
+      </w:r>
+      <w:bookmarkEnd w:id="9"/>
+    </w:p>
+    <w:p>
+      <w:pPr>
+        <w:pStyle w:val="ListParagraph"/>
+        <w:numPr>
+          <w:ilvl w:val="0"/>
+          <w:numId w:val="6"/>
+        </w:numPr>
+      </w:pPr>
+      <w:r>
+        <w:t>API response time shall not exceed 1 second under nominal load.</w:t>
+      </w:r>
+    </w:p>
+    <w:p>
+      <w:pPr>
+        <w:pStyle w:val="Heading3"/>
+      </w:pPr>
+      <w:bookmarkStart w:id="10" w:name="_Toc222231073"/>
+      <w:r>
+        <w:t>Reliability</w:t>
+      </w:r>
+      <w:bookmarkEnd w:id="10"/>
+    </w:p>
+    <w:p>
+      <w:pPr>
+        <w:pStyle w:val="ListParagraph"/>
+        <w:numPr>
+          <w:ilvl w:val="0"/>
+          <w:numId w:val="6"/>
+        </w:numPr>
+      </w:pPr>
+      <w:r>
+        <w:t>The system shall maintain financial data consistency.</w:t>
+      </w:r>
+    </w:p>
+    <w:p>
+      <w:pPr>
+        <w:pStyle w:val="ListParagraph"/>
+        <w:numPr>
+          <w:ilvl w:val="0"/>
+          <w:numId w:val="6"/>
+        </w:numPr>
+      </w:pPr>
+      <w:r>
+        <w:t>Failed payment transactions shall not affect balances.</w:t>
+      </w:r>
+    </w:p>
+    <w:p>
+      <w:pPr>
+        <w:pStyle w:val="Heading3"/>
+      </w:pPr>
+      <w:bookmarkStart w:id="11" w:name="_Toc222231074"/>
+      <w:r>
+        <w:t>Usability</w:t>
+      </w:r>
+      <w:bookmarkEnd w:id="11"/>
+    </w:p>
+    <w:p>
+      <w:pPr>
+        <w:pStyle w:val="ListParagraph"/>
+        <w:numPr>
+          <w:ilvl w:val="0"/>
+          <w:numId w:val="6"/>
+        </w:numPr>
+      </w:pPr>
+      <w:r>
+        <w:t>User interface shall be intuitive and clear.</w:t>
+      </w:r>
+    </w:p>
+    <w:p>
+      <w:pPr>
+        <w:pStyle w:val="ListParagraph"/>
+        <w:numPr>
+          <w:ilvl w:val="0"/>
+          <w:numId w:val="6"/>
+        </w:numPr>
+      </w:pPr>
+      <w:r>
+        <w:t>Adding an expense shall require a minimal number of steps</w:t>
+      </w:r>
+      <w:r>
+        <w:t>.</w:t>
+      </w:r>
+    </w:p>
+    <w:p>
+      <w:pPr>
+        <w:pStyle w:val="Heading3"/>
+      </w:pPr>
+      <w:bookmarkStart w:id="12" w:name="_Toc222231075"/>
+      <w:r>
+        <w:t>Scalability</w:t>
+      </w:r>
+      <w:bookmarkEnd w:id="12"/>
+    </w:p>
+    <w:p>
+      <w:pPr>
+        <w:pStyle w:val="ListParagraph"/>
+        <w:numPr>
+          <w:ilvl w:val="0"/>
+          <w:numId w:val="6"/>
+        </w:numPr>
+      </w:pPr>
+      <w:r>
+        <w:t>The system shall allow future integration of additional</w:t>
+      </w:r>
+      <w:r>
+        <w:t xml:space="preserve"> features.</w:t>
+      </w:r>
+    </w:p>
+    <w:p>
+      <w:pPr>
+        <w:pStyle w:val="Heading3"/>
+      </w:pPr>
+      <w:bookmarkStart w:id="13" w:name="_Toc222231076"/>
+      <w:r>
+        <w:lastRenderedPageBreak/>
+        <w:t>Compatibility</w:t>
+      </w:r>
+      <w:bookmarkEnd w:id="13"/>
+    </w:p>
+    <w:p>
+      <w:pPr>
+        <w:pStyle w:val="ListParagraph"/>
+        <w:numPr>
+          <w:ilvl w:val="0"/>
+          <w:numId w:val="6"/>
+        </w:numPr>
+      </w:pPr>
+      <w:r>
+        <w:t>The application shall function in current versions of major web browsers.</w:t>
+      </w:r>
+    </w:p>
+    <w:p>
+      <w:pPr>
+        <w:pStyle w:val="ListParagraph"/>
+        <w:numPr>
+          <w:ilvl w:val="0"/>
+          <w:numId w:val="6"/>
+        </w:numPr>
+      </w:pPr>
+      <w:r>
+        <w:t>The system shall not require additional software installation on the client side.</w:t>
+      </w:r>
+      <w:r>
+        <w:t xml:space="preserve"> </w:t>
+      </w:r>
+    </w:p>
+    <w:p>
+      <w:pPr>
+        <w:pStyle w:val="ListParagraph"/>
+        <w:numPr>
+          <w:ilvl w:val="0"/>
+          <w:numId w:val="6"/>
+        </w:numPr>
+      </w:pPr>
+      <w:r>
+        <w:t>The application shall function and be responsive for different screen sizes.</w:t>
+      </w:r>
+    </w:p>
+    <w:p/>
+    <w:p>
+      <w:r>
+        <w:t>To be continue</w:t>
+      </w:r>
+      <w:r>
         <w:br w:type="page"/>
       </w:r>
     </w:p>
     <w:p>
       <w:pPr>
-        <w:rPr>
-          <w:lang w:val="pl-PL"/>
-        </w:rPr>
-      </w:pPr>
-    </w:p>
-    <w:p>
-      <w:pPr>
         <w:pStyle w:val="Heading1"/>
         <w:rPr>
           <w:lang w:val="pl-PL"/>
         </w:rPr>
       </w:pPr>
-      <w:bookmarkStart w:id="4" w:name="_Toc222066117"/>
-      <w:r>
-        <w:rPr>
-          <w:lang w:val="pl-PL"/>
-        </w:rPr>
+      <w:bookmarkStart w:id="14" w:name="_Toc222231077"/>
+      <w:r>
+        <w:rPr>
+          <w:lang w:val="pl-PL"/>
+        </w:rPr>
+        <w:lastRenderedPageBreak/>
         <w:t>Technology stack</w:t>
       </w:r>
-      <w:bookmarkEnd w:id="4"/>
+      <w:bookmarkEnd w:id="14"/>
     </w:p>
     <w:p>
       <w:pPr>
@@ -2277,7 +4935,7 @@
           <w:lang w:val="pl-PL"/>
         </w:rPr>
       </w:pPr>
-      <w:bookmarkStart w:id="5" w:name="_Toc222066118"/>
+      <w:bookmarkStart w:id="15" w:name="_Toc222231078"/>
       <w:r>
         <w:rPr>
           <w:lang w:val="pl-PL"/>
@@ -2290,7 +4948,7 @@
         </w:rPr>
         <w:t xml:space="preserve"> - PostgreSQL</w:t>
       </w:r>
-      <w:bookmarkEnd w:id="5"/>
+      <w:bookmarkEnd w:id="15"/>
     </w:p>
     <w:p>
       <w:r>
@@ -2325,14 +4983,14 @@
       <w:pPr>
         <w:pStyle w:val="Heading2"/>
       </w:pPr>
-      <w:bookmarkStart w:id="6" w:name="_Toc222066119"/>
+      <w:bookmarkStart w:id="16" w:name="_Toc222231079"/>
       <w:r>
         <w:t>Backend</w:t>
       </w:r>
       <w:r>
         <w:t xml:space="preserve">  - FastAPI</w:t>
       </w:r>
-      <w:bookmarkEnd w:id="6"/>
+      <w:bookmarkEnd w:id="16"/>
     </w:p>
     <w:p>
       <w:r>
@@ -2358,7 +5016,7 @@
       <w:pPr>
         <w:pStyle w:val="Heading2"/>
       </w:pPr>
-      <w:bookmarkStart w:id="7" w:name="_Toc222066120"/>
+      <w:bookmarkStart w:id="17" w:name="_Toc222231080"/>
       <w:r>
         <w:t xml:space="preserve">Security </w:t>
       </w:r>
@@ -2368,7 +5026,7 @@
       <w:r>
         <w:t xml:space="preserve"> JSON Web Token</w:t>
       </w:r>
-      <w:bookmarkEnd w:id="7"/>
+      <w:bookmarkEnd w:id="17"/>
     </w:p>
     <w:p>
       <w:r>
@@ -2390,7 +5048,7 @@
       <w:pPr>
         <w:pStyle w:val="Heading2"/>
       </w:pPr>
-      <w:bookmarkStart w:id="8" w:name="_Toc222066121"/>
+      <w:bookmarkStart w:id="18" w:name="_Toc222231081"/>
       <w:r>
         <w:t>Frontend</w:t>
       </w:r>
@@ -2400,7 +5058,7 @@
       <w:r>
         <w:t>React &amp; Tailwind CSS</w:t>
       </w:r>
-      <w:bookmarkEnd w:id="8"/>
+      <w:bookmarkEnd w:id="18"/>
     </w:p>
     <w:p>
       <w:r>
@@ -2426,15 +5084,6 @@
       </w:r>
     </w:p>
     <w:p>
-      <w:pPr>
-        <w:rPr>
-          <w:rFonts w:asciiTheme="majorHAnsi" w:eastAsiaTheme="majorEastAsia" w:hAnsiTheme="majorHAnsi" w:cstheme="majorBidi"/>
-          <w:b/>
-          <w:color w:val="000000" w:themeColor="text1"/>
-          <w:sz w:val="28"/>
-          <w:szCs w:val="32"/>
-        </w:rPr>
-      </w:pPr>
       <w:r>
         <w:t>The combination of React and Tailwind CSS enabled the creation of a clear, modular, and scalable user interface that can be expanded with additional views and functionalities in the future.</w:t>
       </w:r>
@@ -2443,11 +5092,19 @@
       <w:pPr>
         <w:pStyle w:val="Heading2"/>
       </w:pPr>
-      <w:bookmarkStart w:id="9" w:name="_Toc222066122"/>
+      <w:r>
+        <w:t>Vite  - bundler?</w:t>
+      </w:r>
+    </w:p>
+    <w:p>
+      <w:pPr>
+        <w:pStyle w:val="Heading2"/>
+      </w:pPr>
+      <w:bookmarkStart w:id="19" w:name="_Toc222231082"/>
       <w:r>
         <w:t>Version Table</w:t>
       </w:r>
-      <w:bookmarkEnd w:id="9"/>
+      <w:bookmarkEnd w:id="19"/>
     </w:p>
     <w:tbl>
       <w:tblPr>
@@ -2570,7 +5227,7 @@
           <w:szCs w:val="20"/>
         </w:rPr>
       </w:pPr>
-      <w:bookmarkStart w:id="10" w:name="_Toc222064758"/>
+      <w:bookmarkStart w:id="20" w:name="_Toc222064758"/>
       <w:r>
         <w:rPr>
           <w:i w:val="0"/>
@@ -2642,7 +5299,7 @@
         </w:rPr>
         <w:t xml:space="preserve"> Technologies version table</w:t>
       </w:r>
-      <w:bookmarkEnd w:id="10"/>
+      <w:bookmarkEnd w:id="20"/>
     </w:p>
     <w:p>
       <w:r>
@@ -2656,15 +5313,27 @@
           <w:lang w:val="pl-PL"/>
         </w:rPr>
       </w:pPr>
-      <w:bookmarkStart w:id="11" w:name="_Toc222066123"/>
+      <w:bookmarkStart w:id="21" w:name="_Toc222231083"/>
       <w:r>
         <w:rPr>
           <w:lang w:val="pl-PL"/>
         </w:rPr>
         <w:lastRenderedPageBreak/>
-        <w:t>System Architecture</w:t>
-      </w:r>
-      <w:bookmarkEnd w:id="11"/>
+        <w:t xml:space="preserve">System </w:t>
+      </w:r>
+      <w:r>
+        <w:rPr>
+          <w:lang w:val="pl-PL"/>
+        </w:rPr>
+        <w:t>a</w:t>
+      </w:r>
+      <w:r>
+        <w:rPr>
+          <w:lang w:val="pl-PL"/>
+        </w:rPr>
+        <w:t>rchitecture</w:t>
+      </w:r>
+      <w:bookmarkEnd w:id="21"/>
     </w:p>
     <w:p>
       <w:pPr>
@@ -2673,26 +5342,70 @@
           <w:lang w:val="pl-PL"/>
         </w:rPr>
       </w:pPr>
-      <w:bookmarkStart w:id="12" w:name="_Toc222066124"/>
-      <w:r>
-        <w:rPr>
-          <w:lang w:val="pl-PL"/>
-        </w:rPr>
-        <w:t>Database diagram</w:t>
-      </w:r>
-      <w:bookmarkEnd w:id="12"/>
-    </w:p>
-    <w:p>
-      <w:pPr>
-        <w:rPr>
-          <w:lang w:val="pl-PL"/>
-        </w:rPr>
-      </w:pPr>
-      <w:r>
-        <w:rPr>
-          <w:lang w:val="pl-PL"/>
-        </w:rPr>
-        <w:t>Diagramik bazy z drawsql</w:t>
+      <w:bookmarkStart w:id="22" w:name="_Toc222231084"/>
+      <w:r>
+        <w:rPr>
+          <w:lang w:val="pl-PL"/>
+        </w:rPr>
+        <w:t xml:space="preserve">Architectural </w:t>
+      </w:r>
+      <w:r>
+        <w:rPr>
+          <w:lang w:val="pl-PL"/>
+        </w:rPr>
+        <w:t>o</w:t>
+      </w:r>
+      <w:r>
+        <w:rPr>
+          <w:lang w:val="pl-PL"/>
+        </w:rPr>
+        <w:t>verwiew</w:t>
+      </w:r>
+      <w:bookmarkEnd w:id="22"/>
+    </w:p>
+    <w:p>
+      <w:pPr>
+        <w:rPr>
+          <w:lang w:val="pl-PL"/>
+        </w:rPr>
+      </w:pPr>
+      <w:r>
+        <w:rPr>
+          <w:lang w:val="pl-PL"/>
+        </w:rPr>
+        <w:t>Fronted-&gt;Backend-&gt;Database</w:t>
+      </w:r>
+    </w:p>
+    <w:p>
+      <w:pPr>
+        <w:rPr>
+          <w:lang w:val="pl-PL"/>
+        </w:rPr>
+      </w:pPr>
+      <w:r>
+        <w:rPr>
+          <w:lang w:val="pl-PL"/>
+        </w:rPr>
+        <w:t>REST API i http</w:t>
+      </w:r>
+    </w:p>
+    <w:p>
+      <w:pPr>
+        <w:rPr>
+          <w:lang w:val="pl-PL"/>
+        </w:rPr>
+      </w:pPr>
+      <w:r>
+        <w:rPr>
+          <w:lang w:val="pl-PL"/>
+        </w:rPr>
+        <w:t>Diagram</w:t>
+      </w:r>
+      <w:r>
+        <w:rPr>
+          <w:lang w:val="pl-PL"/>
+        </w:rPr>
+        <w:t xml:space="preserve"> blokowy</w:t>
       </w:r>
     </w:p>
     <w:p>
@@ -2702,32 +5415,284 @@
           <w:lang w:val="pl-PL"/>
         </w:rPr>
       </w:pPr>
-      <w:bookmarkStart w:id="13" w:name="_Toc222066125"/>
-      <w:r>
-        <w:rPr>
-          <w:lang w:val="pl-PL"/>
-        </w:rPr>
-        <w:t>Backend</w:t>
-      </w:r>
-      <w:bookmarkEnd w:id="13"/>
+      <w:bookmarkStart w:id="23" w:name="_Toc222231085"/>
+      <w:r>
+        <w:rPr>
+          <w:lang w:val="pl-PL"/>
+        </w:rPr>
+        <w:t xml:space="preserve">Backend </w:t>
+      </w:r>
+      <w:r>
+        <w:rPr>
+          <w:lang w:val="pl-PL"/>
+        </w:rPr>
+        <w:t>a</w:t>
+      </w:r>
+      <w:r>
+        <w:rPr>
+          <w:lang w:val="pl-PL"/>
+        </w:rPr>
+        <w:t>rchitecture</w:t>
+      </w:r>
+      <w:bookmarkEnd w:id="23"/>
+    </w:p>
+    <w:p>
+      <w:pPr>
+        <w:rPr>
+          <w:lang w:val="pl-PL"/>
+        </w:rPr>
+      </w:pPr>
+      <w:r>
+        <w:rPr>
+          <w:lang w:val="pl-PL"/>
+        </w:rPr>
+        <w:t>Opis layered architecture</w:t>
+      </w:r>
+    </w:p>
+    <w:p>
+      <w:pPr>
+        <w:rPr>
+          <w:lang w:val="pl-PL"/>
+        </w:rPr>
+      </w:pPr>
+      <w:r>
+        <w:rPr>
+          <w:lang w:val="pl-PL"/>
+        </w:rPr>
+        <w:t>Odpowiedzialność warstw</w:t>
+      </w:r>
+    </w:p>
+    <w:p>
+      <w:pPr>
+        <w:rPr>
+          <w:lang w:val="pl-PL"/>
+        </w:rPr>
+      </w:pPr>
+      <w:r>
+        <w:rPr>
+          <w:lang w:val="pl-PL"/>
+        </w:rPr>
+        <w:t xml:space="preserve">Przepływ requesta </w:t>
+      </w:r>
+    </w:p>
+    <w:p>
+      <w:pPr>
+        <w:rPr>
+          <w:lang w:val="pl-PL"/>
+        </w:rPr>
+      </w:pPr>
+      <w:r>
+        <w:rPr>
+          <w:lang w:val="pl-PL"/>
+        </w:rPr>
+        <w:t>Diagram</w:t>
+      </w:r>
+    </w:p>
+    <w:p>
+      <w:pPr>
+        <w:pStyle w:val="Heading2"/>
+        <w:rPr>
+          <w:lang w:val="pl-PL"/>
+        </w:rPr>
+      </w:pPr>
+      <w:bookmarkStart w:id="24" w:name="_Toc222231086"/>
+      <w:r>
+        <w:rPr>
+          <w:lang w:val="pl-PL"/>
+        </w:rPr>
+        <w:t xml:space="preserve">Database </w:t>
+      </w:r>
+      <w:r>
+        <w:rPr>
+          <w:lang w:val="pl-PL"/>
+        </w:rPr>
+        <w:t>a</w:t>
+      </w:r>
+      <w:r>
+        <w:rPr>
+          <w:lang w:val="pl-PL"/>
+        </w:rPr>
+        <w:t>rchitecture</w:t>
+      </w:r>
+      <w:bookmarkEnd w:id="24"/>
+    </w:p>
+    <w:p>
+      <w:pPr>
+        <w:rPr>
+          <w:lang w:val="pl-PL"/>
+        </w:rPr>
+      </w:pPr>
+      <w:r>
+        <w:rPr>
+          <w:lang w:val="pl-PL"/>
+        </w:rPr>
+        <w:t>Relacyjny model danych</w:t>
+      </w:r>
+    </w:p>
+    <w:p>
+      <w:pPr>
+        <w:rPr>
+          <w:lang w:val="pl-PL"/>
+        </w:rPr>
+      </w:pPr>
+      <w:r>
+        <w:rPr>
+          <w:lang w:val="pl-PL"/>
+        </w:rPr>
+        <w:t>Relacje między tabelami</w:t>
+      </w:r>
+    </w:p>
+    <w:p>
+      <w:pPr>
+        <w:rPr>
+          <w:lang w:val="pl-PL"/>
+        </w:rPr>
+      </w:pPr>
+      <w:r>
+        <w:rPr>
+          <w:lang w:val="pl-PL"/>
+        </w:rPr>
+        <w:t>Diagram</w:t>
+      </w:r>
+    </w:p>
+    <w:p>
+      <w:pPr>
+        <w:pStyle w:val="Heading2"/>
+        <w:rPr>
+          <w:lang w:val="pl-PL"/>
+        </w:rPr>
+      </w:pPr>
+      <w:bookmarkStart w:id="25" w:name="_Toc222231087"/>
+      <w:r>
+        <w:rPr>
+          <w:lang w:val="pl-PL"/>
+        </w:rPr>
+        <w:t xml:space="preserve">Security </w:t>
+      </w:r>
+      <w:r>
+        <w:rPr>
+          <w:lang w:val="pl-PL"/>
+        </w:rPr>
+        <w:t>a</w:t>
+      </w:r>
+      <w:r>
+        <w:rPr>
+          <w:lang w:val="pl-PL"/>
+        </w:rPr>
+        <w:t>rchitecture</w:t>
+      </w:r>
+      <w:bookmarkEnd w:id="25"/>
+    </w:p>
+    <w:p>
+      <w:pPr>
+        <w:rPr>
+          <w:lang w:val="pl-PL"/>
+        </w:rPr>
+      </w:pPr>
+      <w:r>
+        <w:rPr>
+          <w:lang w:val="pl-PL"/>
+        </w:rPr>
+        <w:t xml:space="preserve">JWT </w:t>
+      </w:r>
+    </w:p>
+    <w:p>
+      <w:pPr>
+        <w:rPr>
+          <w:lang w:val="pl-PL"/>
+        </w:rPr>
+      </w:pPr>
+      <w:r>
+        <w:rPr>
+          <w:lang w:val="pl-PL"/>
+        </w:rPr>
+        <w:t>Role-based access control</w:t>
+      </w:r>
+    </w:p>
+    <w:p>
+      <w:pPr>
+        <w:rPr>
+          <w:lang w:val="pl-PL"/>
+        </w:rPr>
+      </w:pPr>
+      <w:r>
+        <w:rPr>
+          <w:lang w:val="pl-PL"/>
+        </w:rPr>
+        <w:t>DI to protect endpoints</w:t>
+      </w:r>
+    </w:p>
+    <w:p>
+      <w:pPr>
+        <w:pStyle w:val="Heading2"/>
+        <w:rPr>
+          <w:lang w:val="pl-PL"/>
+        </w:rPr>
+      </w:pPr>
+      <w:bookmarkStart w:id="26" w:name="_Toc222231088"/>
+      <w:r>
+        <w:rPr>
+          <w:lang w:val="pl-PL"/>
+        </w:rPr>
+        <w:t>Frontend</w:t>
+      </w:r>
       <w:r>
         <w:rPr>
           <w:lang w:val="pl-PL"/>
         </w:rPr>
         <w:t xml:space="preserve"> </w:t>
       </w:r>
-    </w:p>
-    <w:p>
-      <w:pPr>
-        <w:rPr>
-          <w:lang w:val="pl-PL"/>
-        </w:rPr>
-      </w:pPr>
-      <w:r>
-        <w:rPr>
-          <w:lang w:val="pl-PL"/>
-        </w:rPr>
-        <w:t>Opis layered architecture</w:t>
+      <w:r>
+        <w:rPr>
+          <w:lang w:val="pl-PL"/>
+        </w:rPr>
+        <w:t>a</w:t>
+      </w:r>
+      <w:r>
+        <w:rPr>
+          <w:lang w:val="pl-PL"/>
+        </w:rPr>
+        <w:t>rchitecture</w:t>
+      </w:r>
+      <w:bookmarkEnd w:id="26"/>
+    </w:p>
+    <w:p>
+      <w:pPr>
+        <w:rPr>
+          <w:lang w:val="pl-PL"/>
+        </w:rPr>
+      </w:pPr>
+      <w:r>
+        <w:rPr>
+          <w:lang w:val="pl-PL"/>
+        </w:rPr>
+        <w:t>Routing i ochrona widoków</w:t>
+      </w:r>
+    </w:p>
+    <w:p>
+      <w:pPr>
+        <w:rPr>
+          <w:lang w:val="pl-PL"/>
+        </w:rPr>
+      </w:pPr>
+      <w:r>
+        <w:rPr>
+          <w:lang w:val="pl-PL"/>
+        </w:rPr>
+        <w:t>Przechowywanie danych zalogowanego użytkownika w AuthContext</w:t>
+      </w:r>
+    </w:p>
+    <w:p>
+      <w:pPr>
+        <w:rPr>
+          <w:lang w:val="pl-PL"/>
+        </w:rPr>
+      </w:pPr>
+      <w:r>
+        <w:rPr>
+          <w:lang w:val="pl-PL"/>
+        </w:rPr>
+        <w:t>Opis widoków</w:t>
       </w:r>
     </w:p>
     <w:p>
@@ -2737,26 +5702,25 @@
           <w:lang w:val="pl-PL"/>
         </w:rPr>
       </w:pPr>
-      <w:bookmarkStart w:id="14" w:name="_Toc222066126"/>
-      <w:r>
-        <w:rPr>
-          <w:lang w:val="pl-PL"/>
-        </w:rPr>
-        <w:t>Frontend</w:t>
-      </w:r>
-      <w:bookmarkEnd w:id="14"/>
-    </w:p>
-    <w:p>
-      <w:pPr>
-        <w:rPr>
-          <w:lang w:val="pl-PL"/>
-        </w:rPr>
-      </w:pPr>
-      <w:r>
-        <w:rPr>
-          <w:lang w:val="pl-PL"/>
-        </w:rPr>
-        <w:t>Struktura widoków czy coś</w:t>
+      <w:r>
+        <w:rPr>
+          <w:lang w:val="pl-PL"/>
+        </w:rPr>
+        <w:t>External integrations</w:t>
+      </w:r>
+    </w:p>
+    <w:p>
+      <w:pPr>
+        <w:pStyle w:val="Heading3"/>
+        <w:rPr>
+          <w:lang w:val="pl-PL"/>
+        </w:rPr>
+      </w:pPr>
+      <w:r>
+        <w:rPr>
+          <w:lang w:val="pl-PL"/>
+        </w:rPr>
+        <w:t>Integration with PayPal API</w:t>
       </w:r>
     </w:p>
     <w:p>
@@ -2772,15 +5736,423 @@
         </w:rPr>
         <w:br w:type="page"/>
       </w:r>
-      <w:bookmarkStart w:id="15" w:name="_Toc222066127"/>
+      <w:bookmarkStart w:id="27" w:name="_Toc222231089"/>
       <w:r>
         <w:rPr>
           <w:lang w:val="pl-PL"/>
         </w:rPr>
         <w:lastRenderedPageBreak/>
-        <w:t>Implementation</w:t>
-      </w:r>
-      <w:bookmarkEnd w:id="15"/>
+        <w:t>System i</w:t>
+      </w:r>
+      <w:r>
+        <w:rPr>
+          <w:lang w:val="pl-PL"/>
+        </w:rPr>
+        <w:t>mplementation</w:t>
+      </w:r>
+      <w:bookmarkEnd w:id="27"/>
+    </w:p>
+    <w:p>
+      <w:pPr>
+        <w:pStyle w:val="Heading2"/>
+        <w:rPr>
+          <w:lang w:val="pl-PL"/>
+        </w:rPr>
+      </w:pPr>
+      <w:bookmarkStart w:id="28" w:name="_Toc222231090"/>
+      <w:r>
+        <w:rPr>
+          <w:lang w:val="pl-PL"/>
+        </w:rPr>
+        <w:t>Backend implementation</w:t>
+      </w:r>
+      <w:bookmarkEnd w:id="28"/>
+    </w:p>
+    <w:p>
+      <w:pPr>
+        <w:pStyle w:val="Heading3"/>
+        <w:rPr>
+          <w:lang w:val="pl-PL"/>
+        </w:rPr>
+      </w:pPr>
+      <w:bookmarkStart w:id="29" w:name="_Toc222231091"/>
+      <w:r>
+        <w:rPr>
+          <w:lang w:val="pl-PL"/>
+        </w:rPr>
+        <w:t>Structure</w:t>
+      </w:r>
+      <w:bookmarkEnd w:id="29"/>
+    </w:p>
+    <w:p>
+      <w:pPr>
+        <w:rPr>
+          <w:lang w:val="pl-PL"/>
+        </w:rPr>
+      </w:pPr>
+      <w:r>
+        <w:rPr>
+          <w:lang w:val="pl-PL"/>
+        </w:rPr>
+        <w:t>Strukture folderów</w:t>
+      </w:r>
+    </w:p>
+    <w:p>
+      <w:pPr>
+        <w:pStyle w:val="Heading3"/>
+        <w:rPr>
+          <w:lang w:val="pl-PL"/>
+        </w:rPr>
+      </w:pPr>
+      <w:bookmarkStart w:id="30" w:name="_Toc222231092"/>
+      <w:r>
+        <w:rPr>
+          <w:lang w:val="pl-PL"/>
+        </w:rPr>
+        <w:t>API endpoints</w:t>
+      </w:r>
+      <w:bookmarkEnd w:id="30"/>
+    </w:p>
+    <w:p>
+      <w:r>
+        <w:t>Struktura endpoi</w:t>
+      </w:r>
+      <w:r>
+        <w:t>ntów</w:t>
+      </w:r>
+    </w:p>
+    <w:p>
+      <w:pPr>
+        <w:pStyle w:val="Heading3"/>
+      </w:pPr>
+      <w:bookmarkStart w:id="31" w:name="_Toc222231093"/>
+      <w:r>
+        <w:t>Business logic layer</w:t>
+      </w:r>
+      <w:bookmarkEnd w:id="31"/>
+    </w:p>
+    <w:p>
+      <w:r>
+        <w:t>Implementacja service layer</w:t>
+      </w:r>
+    </w:p>
+    <w:p>
+      <w:r>
+        <w:t>Przykłady operacji</w:t>
+      </w:r>
+    </w:p>
+    <w:p>
+      <w:pPr>
+        <w:pStyle w:val="Heading3"/>
+      </w:pPr>
+      <w:bookmarkStart w:id="32" w:name="_Toc222231094"/>
+      <w:r>
+        <w:t>Data access layer</w:t>
+      </w:r>
+      <w:bookmarkEnd w:id="32"/>
+    </w:p>
+    <w:p>
+      <w:r>
+        <w:t>Implementacja repository layer</w:t>
+      </w:r>
+    </w:p>
+    <w:p>
+      <w:r>
+        <w:t>Komunikacja z postgresql</w:t>
+      </w:r>
+    </w:p>
+    <w:p>
+      <w:pPr>
+        <w:pStyle w:val="Heading2"/>
+      </w:pPr>
+      <w:bookmarkStart w:id="33" w:name="_Toc222231095"/>
+      <w:r>
+        <w:t>Authentication and Authorization Implementation</w:t>
+      </w:r>
+      <w:bookmarkEnd w:id="33"/>
+    </w:p>
+    <w:p>
+      <w:pPr>
+        <w:pStyle w:val="Heading3"/>
+        <w:rPr>
+          <w:lang w:val="pl-PL"/>
+        </w:rPr>
+      </w:pPr>
+      <w:bookmarkStart w:id="34" w:name="_Toc222231096"/>
+      <w:r>
+        <w:rPr>
+          <w:lang w:val="pl-PL"/>
+        </w:rPr>
+        <w:t>JWT generation</w:t>
+      </w:r>
+      <w:bookmarkEnd w:id="34"/>
+    </w:p>
+    <w:p>
+      <w:pPr>
+        <w:rPr>
+          <w:lang w:val="pl-PL"/>
+        </w:rPr>
+      </w:pPr>
+      <w:r>
+        <w:rPr>
+          <w:lang w:val="pl-PL"/>
+        </w:rPr>
+        <w:t>generowanie JWT</w:t>
+      </w:r>
+    </w:p>
+    <w:p>
+      <w:pPr>
+        <w:pStyle w:val="Heading3"/>
+        <w:rPr>
+          <w:lang w:val="pl-PL"/>
+        </w:rPr>
+      </w:pPr>
+      <w:bookmarkStart w:id="35" w:name="_Toc222231097"/>
+      <w:r>
+        <w:rPr>
+          <w:lang w:val="pl-PL"/>
+        </w:rPr>
+        <w:t>Token verification</w:t>
+      </w:r>
+      <w:bookmarkEnd w:id="35"/>
+    </w:p>
+    <w:p>
+      <w:pPr>
+        <w:rPr>
+          <w:lang w:val="pl-PL"/>
+        </w:rPr>
+      </w:pPr>
+      <w:r>
+        <w:rPr>
+          <w:lang w:val="pl-PL"/>
+        </w:rPr>
+        <w:t xml:space="preserve">Weryfikacja tokena </w:t>
+      </w:r>
+    </w:p>
+    <w:p>
+      <w:pPr>
+        <w:pStyle w:val="Heading3"/>
+        <w:rPr>
+          <w:lang w:val="pl-PL"/>
+        </w:rPr>
+      </w:pPr>
+      <w:bookmarkStart w:id="36" w:name="_Toc222231098"/>
+      <w:r>
+        <w:rPr>
+          <w:lang w:val="pl-PL"/>
+        </w:rPr>
+        <w:t>Dependency injection</w:t>
+      </w:r>
+      <w:bookmarkEnd w:id="36"/>
+    </w:p>
+    <w:p>
+      <w:pPr>
+        <w:rPr>
+          <w:lang w:val="pl-PL"/>
+        </w:rPr>
+      </w:pPr>
+      <w:r>
+        <w:rPr>
+          <w:lang w:val="pl-PL"/>
+        </w:rPr>
+        <w:t xml:space="preserve">DI </w:t>
+      </w:r>
+      <w:r>
+        <w:rPr>
+          <w:lang w:val="pl-PL"/>
+        </w:rPr>
+        <w:t>dla zabezpieczenia endpointów z rozróżnieniem ról</w:t>
+      </w:r>
+    </w:p>
+    <w:p>
+      <w:pPr>
+        <w:pStyle w:val="Heading2"/>
+        <w:rPr>
+          <w:lang w:val="pl-PL"/>
+        </w:rPr>
+      </w:pPr>
+      <w:bookmarkStart w:id="37" w:name="_Toc222231099"/>
+      <w:r>
+        <w:rPr>
+          <w:lang w:val="pl-PL"/>
+        </w:rPr>
+        <w:t>Frontend implementation</w:t>
+      </w:r>
+      <w:bookmarkEnd w:id="37"/>
+    </w:p>
+    <w:p>
+      <w:pPr>
+        <w:pStyle w:val="Heading3"/>
+        <w:rPr>
+          <w:lang w:val="pl-PL"/>
+        </w:rPr>
+      </w:pPr>
+      <w:bookmarkStart w:id="38" w:name="_Toc222231100"/>
+      <w:r>
+        <w:rPr>
+          <w:lang w:val="pl-PL"/>
+        </w:rPr>
+        <w:t>Structure</w:t>
+      </w:r>
+      <w:bookmarkEnd w:id="38"/>
+    </w:p>
+    <w:p>
+      <w:pPr>
+        <w:rPr>
+          <w:lang w:val="pl-PL"/>
+        </w:rPr>
+      </w:pPr>
+      <w:r>
+        <w:rPr>
+          <w:lang w:val="pl-PL"/>
+        </w:rPr>
+        <w:t>Struktura komponentów i routing</w:t>
+      </w:r>
+    </w:p>
+    <w:p>
+      <w:pPr>
+        <w:pStyle w:val="Heading3"/>
+        <w:rPr>
+          <w:lang w:val="pl-PL"/>
+        </w:rPr>
+      </w:pPr>
+      <w:bookmarkStart w:id="39" w:name="_Toc222231101"/>
+      <w:r>
+        <w:rPr>
+          <w:lang w:val="pl-PL"/>
+        </w:rPr>
+        <w:t>Authentication Handling</w:t>
+      </w:r>
+      <w:bookmarkEnd w:id="39"/>
+    </w:p>
+    <w:p>
+      <w:pPr>
+        <w:rPr>
+          <w:lang w:val="pl-PL"/>
+        </w:rPr>
+      </w:pPr>
+      <w:r>
+        <w:rPr>
+          <w:lang w:val="pl-PL"/>
+        </w:rPr>
+        <w:t>Obsługa tokenu</w:t>
+      </w:r>
+    </w:p>
+    <w:p>
+      <w:pPr>
+        <w:rPr>
+          <w:lang w:val="pl-PL"/>
+        </w:rPr>
+      </w:pPr>
+      <w:r>
+        <w:rPr>
+          <w:lang w:val="pl-PL"/>
+        </w:rPr>
+        <w:t>Przechowywanie danych użytkownika</w:t>
+      </w:r>
+    </w:p>
+    <w:p>
+      <w:pPr>
+        <w:rPr>
+          <w:lang w:val="pl-PL"/>
+        </w:rPr>
+      </w:pPr>
+      <w:r>
+        <w:rPr>
+          <w:lang w:val="pl-PL"/>
+        </w:rPr>
+        <w:t>Interceptor</w:t>
+      </w:r>
+    </w:p>
+    <w:p>
+      <w:pPr>
+        <w:pStyle w:val="Heading3"/>
+        <w:rPr>
+          <w:lang w:val="pl-PL"/>
+        </w:rPr>
+      </w:pPr>
+      <w:bookmarkStart w:id="40" w:name="_Toc222231102"/>
+      <w:r>
+        <w:rPr>
+          <w:lang w:val="pl-PL"/>
+        </w:rPr>
+        <w:t>UI implementation</w:t>
+      </w:r>
+      <w:bookmarkEnd w:id="40"/>
+    </w:p>
+    <w:p>
+      <w:pPr>
+        <w:rPr>
+          <w:lang w:val="pl-PL"/>
+        </w:rPr>
+      </w:pPr>
+      <w:r>
+        <w:rPr>
+          <w:lang w:val="pl-PL"/>
+        </w:rPr>
+        <w:t>Implementacja widoków</w:t>
+      </w:r>
+    </w:p>
+    <w:p>
+      <w:pPr>
+        <w:rPr>
+          <w:lang w:val="pl-PL"/>
+        </w:rPr>
+      </w:pPr>
+      <w:r>
+        <w:rPr>
+          <w:lang w:val="pl-PL"/>
+        </w:rPr>
+        <w:t xml:space="preserve">Opisanie </w:t>
+      </w:r>
+      <w:r>
+        <w:rPr>
+          <w:lang w:val="pl-PL"/>
+        </w:rPr>
+        <w:t>requestów na danym widoku</w:t>
+      </w:r>
+    </w:p>
+    <w:p>
+      <w:pPr>
+        <w:rPr>
+          <w:lang w:val="pl-PL"/>
+        </w:rPr>
+      </w:pPr>
+      <w:r>
+        <w:rPr>
+          <w:lang w:val="pl-PL"/>
+        </w:rPr>
+        <w:lastRenderedPageBreak/>
+        <w:t>Obsługa błędów i komunikatów</w:t>
+      </w:r>
+    </w:p>
+    <w:p>
+      <w:pPr>
+        <w:pStyle w:val="Heading2"/>
+        <w:rPr>
+          <w:lang w:val="pl-PL"/>
+        </w:rPr>
+      </w:pPr>
+      <w:r>
+        <w:rPr>
+          <w:lang w:val="pl-PL"/>
+        </w:rPr>
+        <w:t>PayPal API integration implementation</w:t>
+      </w:r>
+    </w:p>
+    <w:p>
+      <w:pPr>
+        <w:rPr>
+          <w:lang w:val="pl-PL"/>
+        </w:rPr>
+      </w:pPr>
+    </w:p>
+    <w:p>
+      <w:pPr>
+        <w:rPr>
+          <w:lang w:val="pl-PL"/>
+        </w:rPr>
+      </w:pPr>
     </w:p>
     <w:p>
       <w:pPr>
@@ -2807,7 +6179,7 @@
           <w:lang w:val="pl-PL"/>
         </w:rPr>
       </w:pPr>
-      <w:bookmarkStart w:id="16" w:name="_Toc222066128"/>
+      <w:bookmarkStart w:id="41" w:name="_Toc222231103"/>
       <w:r>
         <w:rPr>
           <w:lang w:val="pl-PL"/>
@@ -2815,7 +6187,7 @@
         <w:lastRenderedPageBreak/>
         <w:t>Testing</w:t>
       </w:r>
-      <w:bookmarkEnd w:id="16"/>
+      <w:bookmarkEnd w:id="41"/>
     </w:p>
     <w:p>
       <w:pPr>
@@ -2837,7 +6209,7 @@
           <w:lang w:val="pl-PL"/>
         </w:rPr>
       </w:pPr>
-      <w:bookmarkStart w:id="17" w:name="_Toc222066129"/>
+      <w:bookmarkStart w:id="42" w:name="_Toc222231104"/>
       <w:r>
         <w:rPr>
           <w:lang w:val="pl-PL"/>
@@ -2845,7 +6217,7 @@
         <w:lastRenderedPageBreak/>
         <w:t>Summary and conclusions</w:t>
       </w:r>
-      <w:bookmarkEnd w:id="17"/>
+      <w:bookmarkEnd w:id="42"/>
     </w:p>
     <w:p>
       <w:pPr>
@@ -2867,7 +6239,7 @@
           <w:lang w:val="pl-PL"/>
         </w:rPr>
       </w:pPr>
-      <w:bookmarkStart w:id="18" w:name="_Toc222066130"/>
+      <w:bookmarkStart w:id="43" w:name="_Toc222231105"/>
       <w:r>
         <w:rPr>
           <w:lang w:val="pl-PL"/>
@@ -2875,7 +6247,7 @@
         <w:lastRenderedPageBreak/>
         <w:t>Tables list</w:t>
       </w:r>
-      <w:bookmarkEnd w:id="18"/>
+      <w:bookmarkEnd w:id="43"/>
     </w:p>
     <w:p>
       <w:pPr>
@@ -2911,35 +6283,7 @@
             <w:rStyle w:val="Hyperlink"/>
             <w:noProof/>
           </w:rPr>
-          <w:t>Table 1 Technolog</w:t>
-        </w:r>
-        <w:r>
-          <w:rPr>
-            <w:rStyle w:val="Hyperlink"/>
-            <w:noProof/>
-          </w:rPr>
-          <w:t>i</w:t>
-        </w:r>
-        <w:r>
-          <w:rPr>
-            <w:rStyle w:val="Hyperlink"/>
-            <w:noProof/>
-          </w:rPr>
-          <w:t>es</w:t>
-        </w:r>
-        <w:r>
-          <w:rPr>
-            <w:rStyle w:val="Hyperlink"/>
-            <w:noProof/>
-          </w:rPr>
-          <w:t xml:space="preserve"> </w:t>
-        </w:r>
-        <w:r>
-          <w:rPr>
-            <w:rStyle w:val="Hyperlink"/>
-            <w:noProof/>
-          </w:rPr>
-          <w:t>version table</w:t>
+          <w:t>Table 1 Technologies version table</w:t>
         </w:r>
         <w:r>
           <w:rPr>
@@ -3161,6 +6505,119 @@
 <file path=word/numbering.xml><?xml version="1.0" encoding="utf-8"?>
 <w:numbering xmlns:wpc="http://schemas.microsoft.com/office/word/2010/wordprocessingCanvas" xmlns:cx="http://schemas.microsoft.com/office/drawing/2014/chartex" xmlns:cx1="http://schemas.microsoft.com/office/drawing/2015/9/8/chartex" xmlns:cx2="http://schemas.microsoft.com/office/drawing/2015/10/21/chartex" xmlns:cx3="http://schemas.microsoft.com/office/drawing/2016/5/9/chartex" xmlns:cx4="http://schemas.microsoft.com/office/drawing/2016/5/10/chartex" xmlns:cx5="http://schemas.microsoft.com/office/drawing/2016/5/11/chartex" xmlns:cx6="http://schemas.microsoft.com/office/drawing/2016/5/12/chartex" xmlns:cx7="http://schemas.microsoft.com/office/drawing/2016/5/13/chartex" xmlns:cx8="http://schemas.microsoft.com/office/drawing/2016/5/14/chartex" xmlns:mc="http://schemas.openxmlformats.org/markup-compatibility/2006" xmlns:aink="http://schemas.microsoft.com/office/drawing/2016/ink" xmlns:am3d="http://schemas.microsoft.com/office/drawing/2017/model3d" xmlns:o="urn:schemas-microsoft-com:office:office" xmlns:oel="http://schemas.microsoft.com/office/2019/extlst" xmlns:r="http://schemas.openxmlformats.org/officeDocument/2006/relationships" xmlns:m="http://schemas.openxmlformats.org/officeDocument/2006/math" xmlns:v="urn:schemas-microsoft-com:vml" xmlns:wp14="http://schemas.microsoft.com/office/word/2010/wordprocessingDrawing" xmlns:wp="http://schemas.openxmlformats.org/drawingml/2006/wordprocessingDrawing" xmlns:w10="urn:schemas-microsoft-com:office:word" xmlns:w="http://schemas.openxmlformats.org/wordprocessingml/2006/main" xmlns:w14="http://schemas.microsoft.com/office/word/2010/wordml" xmlns:w15="http://schemas.microsoft.com/office/word/2012/wordml" xmlns:w16cex="http://schemas.microsoft.com/office/word/2018/wordml/cex" xmlns:w16cid="http://schemas.microsoft.com/office/word/2016/wordml/cid" xmlns:w16="http://schemas.microsoft.com/office/word/2018/wordml" xmlns:w16du="http://schemas.microsoft.com/office/word/2023/wordml/word16du" xmlns:w16sdtdh="http://schemas.microsoft.com/office/word/2020/wordml/sdtdatahash" xmlns:w16sdtfl="http://schemas.microsoft.com/office/word/2024/wordml/sdtformatlock" xmlns:w16se="http://schemas.microsoft.com/office/word/2015/wordml/symex" xmlns:wpg="http://schemas.microsoft.com/office/word/2010/wordprocessingGroup" xmlns:wpi="http://schemas.microsoft.com/office/word/2010/wordprocessingInk" xmlns:wne="http://schemas.microsoft.com/office/word/2006/wordml" xmlns:wps="http://schemas.microsoft.com/office/word/2010/wordprocessingShape" mc:Ignorable="w14 w15 w16se w16cid w16 w16cex w16sdtdh w16sdtfl w16du wp14">
   <w:abstractNum w:abstractNumId="0" w15:restartNumberingAfterBreak="0">
+    <w:nsid w:val="01FE0D93"/>
+    <w:multiLevelType w:val="hybridMultilevel"/>
+    <w:tmpl w:val="CFD80F9E"/>
+    <w:lvl w:ilvl="0" w:tplc="04150001">
+      <w:start w:val="1"/>
+      <w:numFmt w:val="bullet"/>
+      <w:lvlText w:val=""/>
+      <w:lvlJc w:val="left"/>
+      <w:pPr>
+        <w:ind w:left="720" w:hanging="360"/>
+      </w:pPr>
+      <w:rPr>
+        <w:rFonts w:ascii="Symbol" w:hAnsi="Symbol" w:hint="default"/>
+      </w:rPr>
+    </w:lvl>
+    <w:lvl w:ilvl="1" w:tplc="04150003" w:tentative="1">
+      <w:start w:val="1"/>
+      <w:numFmt w:val="bullet"/>
+      <w:lvlText w:val="o"/>
+      <w:lvlJc w:val="left"/>
+      <w:pPr>
+        <w:ind w:left="1440" w:hanging="360"/>
+      </w:pPr>
+      <w:rPr>
+        <w:rFonts w:ascii="Courier New" w:hAnsi="Courier New" w:cs="Courier New" w:hint="default"/>
+      </w:rPr>
+    </w:lvl>
+    <w:lvl w:ilvl="2" w:tplc="04150005" w:tentative="1">
+      <w:start w:val="1"/>
+      <w:numFmt w:val="bullet"/>
+      <w:lvlText w:val=""/>
+      <w:lvlJc w:val="left"/>
+      <w:pPr>
+        <w:ind w:left="2160" w:hanging="360"/>
+      </w:pPr>
+      <w:rPr>
+        <w:rFonts w:ascii="Wingdings" w:hAnsi="Wingdings" w:hint="default"/>
+      </w:rPr>
+    </w:lvl>
+    <w:lvl w:ilvl="3" w:tplc="04150001" w:tentative="1">
+      <w:start w:val="1"/>
+      <w:numFmt w:val="bullet"/>
+      <w:lvlText w:val=""/>
+      <w:lvlJc w:val="left"/>
+      <w:pPr>
+        <w:ind w:left="2880" w:hanging="360"/>
+      </w:pPr>
+      <w:rPr>
+        <w:rFonts w:ascii="Symbol" w:hAnsi="Symbol" w:hint="default"/>
+      </w:rPr>
+    </w:lvl>
+    <w:lvl w:ilvl="4" w:tplc="04150003" w:tentative="1">
+      <w:start w:val="1"/>
+      <w:numFmt w:val="bullet"/>
+      <w:lvlText w:val="o"/>
+      <w:lvlJc w:val="left"/>
+      <w:pPr>
+        <w:ind w:left="3600" w:hanging="360"/>
+      </w:pPr>
+      <w:rPr>
+        <w:rFonts w:ascii="Courier New" w:hAnsi="Courier New" w:cs="Courier New" w:hint="default"/>
+      </w:rPr>
+    </w:lvl>
+    <w:lvl w:ilvl="5" w:tplc="04150005" w:tentative="1">
+      <w:start w:val="1"/>
+      <w:numFmt w:val="bullet"/>
+      <w:lvlText w:val=""/>
+      <w:lvlJc w:val="left"/>
+      <w:pPr>
+        <w:ind w:left="4320" w:hanging="360"/>
+      </w:pPr>
+      <w:rPr>
+        <w:rFonts w:ascii="Wingdings" w:hAnsi="Wingdings" w:hint="default"/>
+      </w:rPr>
+    </w:lvl>
+    <w:lvl w:ilvl="6" w:tplc="04150001" w:tentative="1">
+      <w:start w:val="1"/>
+      <w:numFmt w:val="bullet"/>
+      <w:lvlText w:val=""/>
+      <w:lvlJc w:val="left"/>
+      <w:pPr>
+        <w:ind w:left="5040" w:hanging="360"/>
+      </w:pPr>
+      <w:rPr>
+        <w:rFonts w:ascii="Symbol" w:hAnsi="Symbol" w:hint="default"/>
+      </w:rPr>
+    </w:lvl>
+    <w:lvl w:ilvl="7" w:tplc="04150003" w:tentative="1">
+      <w:start w:val="1"/>
+      <w:numFmt w:val="bullet"/>
+      <w:lvlText w:val="o"/>
+      <w:lvlJc w:val="left"/>
+      <w:pPr>
+        <w:ind w:left="5760" w:hanging="360"/>
+      </w:pPr>
+      <w:rPr>
+        <w:rFonts w:ascii="Courier New" w:hAnsi="Courier New" w:cs="Courier New" w:hint="default"/>
+      </w:rPr>
+    </w:lvl>
+    <w:lvl w:ilvl="8" w:tplc="04150005" w:tentative="1">
+      <w:start w:val="1"/>
+      <w:numFmt w:val="bullet"/>
+      <w:lvlText w:val=""/>
+      <w:lvlJc w:val="left"/>
+      <w:pPr>
+        <w:ind w:left="6480" w:hanging="360"/>
+      </w:pPr>
+      <w:rPr>
+        <w:rFonts w:ascii="Wingdings" w:hAnsi="Wingdings" w:hint="default"/>
+      </w:rPr>
+    </w:lvl>
+  </w:abstractNum>
+  <w:abstractNum w:abstractNumId="1" w15:restartNumberingAfterBreak="0">
     <w:nsid w:val="10792F5D"/>
     <w:multiLevelType w:val="multilevel"/>
     <w:tmpl w:val="0B701190"/>
@@ -3282,7 +6739,346 @@
       </w:rPr>
     </w:lvl>
   </w:abstractNum>
-  <w:abstractNum w:abstractNumId="1" w15:restartNumberingAfterBreak="0">
+  <w:abstractNum w:abstractNumId="2" w15:restartNumberingAfterBreak="0">
+    <w:nsid w:val="2AEE3715"/>
+    <w:multiLevelType w:val="hybridMultilevel"/>
+    <w:tmpl w:val="E1A28100"/>
+    <w:lvl w:ilvl="0" w:tplc="04150001">
+      <w:start w:val="1"/>
+      <w:numFmt w:val="bullet"/>
+      <w:lvlText w:val=""/>
+      <w:lvlJc w:val="left"/>
+      <w:pPr>
+        <w:ind w:left="720" w:hanging="360"/>
+      </w:pPr>
+      <w:rPr>
+        <w:rFonts w:ascii="Symbol" w:hAnsi="Symbol" w:hint="default"/>
+      </w:rPr>
+    </w:lvl>
+    <w:lvl w:ilvl="1" w:tplc="04150003" w:tentative="1">
+      <w:start w:val="1"/>
+      <w:numFmt w:val="bullet"/>
+      <w:lvlText w:val="o"/>
+      <w:lvlJc w:val="left"/>
+      <w:pPr>
+        <w:ind w:left="1440" w:hanging="360"/>
+      </w:pPr>
+      <w:rPr>
+        <w:rFonts w:ascii="Courier New" w:hAnsi="Courier New" w:cs="Courier New" w:hint="default"/>
+      </w:rPr>
+    </w:lvl>
+    <w:lvl w:ilvl="2" w:tplc="04150005" w:tentative="1">
+      <w:start w:val="1"/>
+      <w:numFmt w:val="bullet"/>
+      <w:lvlText w:val=""/>
+      <w:lvlJc w:val="left"/>
+      <w:pPr>
+        <w:ind w:left="2160" w:hanging="360"/>
+      </w:pPr>
+      <w:rPr>
+        <w:rFonts w:ascii="Wingdings" w:hAnsi="Wingdings" w:hint="default"/>
+      </w:rPr>
+    </w:lvl>
+    <w:lvl w:ilvl="3" w:tplc="04150001" w:tentative="1">
+      <w:start w:val="1"/>
+      <w:numFmt w:val="bullet"/>
+      <w:lvlText w:val=""/>
+      <w:lvlJc w:val="left"/>
+      <w:pPr>
+        <w:ind w:left="2880" w:hanging="360"/>
+      </w:pPr>
+      <w:rPr>
+        <w:rFonts w:ascii="Symbol" w:hAnsi="Symbol" w:hint="default"/>
+      </w:rPr>
+    </w:lvl>
+    <w:lvl w:ilvl="4" w:tplc="04150003" w:tentative="1">
+      <w:start w:val="1"/>
+      <w:numFmt w:val="bullet"/>
+      <w:lvlText w:val="o"/>
+      <w:lvlJc w:val="left"/>
+      <w:pPr>
+        <w:ind w:left="3600" w:hanging="360"/>
+      </w:pPr>
+      <w:rPr>
+        <w:rFonts w:ascii="Courier New" w:hAnsi="Courier New" w:cs="Courier New" w:hint="default"/>
+      </w:rPr>
+    </w:lvl>
+    <w:lvl w:ilvl="5" w:tplc="04150005" w:tentative="1">
+      <w:start w:val="1"/>
+      <w:numFmt w:val="bullet"/>
+      <w:lvlText w:val=""/>
+      <w:lvlJc w:val="left"/>
+      <w:pPr>
+        <w:ind w:left="4320" w:hanging="360"/>
+      </w:pPr>
+      <w:rPr>
+        <w:rFonts w:ascii="Wingdings" w:hAnsi="Wingdings" w:hint="default"/>
+      </w:rPr>
+    </w:lvl>
+    <w:lvl w:ilvl="6" w:tplc="04150001" w:tentative="1">
+      <w:start w:val="1"/>
+      <w:numFmt w:val="bullet"/>
+      <w:lvlText w:val=""/>
+      <w:lvlJc w:val="left"/>
+      <w:pPr>
+        <w:ind w:left="5040" w:hanging="360"/>
+      </w:pPr>
+      <w:rPr>
+        <w:rFonts w:ascii="Symbol" w:hAnsi="Symbol" w:hint="default"/>
+      </w:rPr>
+    </w:lvl>
+    <w:lvl w:ilvl="7" w:tplc="04150003" w:tentative="1">
+      <w:start w:val="1"/>
+      <w:numFmt w:val="bullet"/>
+      <w:lvlText w:val="o"/>
+      <w:lvlJc w:val="left"/>
+      <w:pPr>
+        <w:ind w:left="5760" w:hanging="360"/>
+      </w:pPr>
+      <w:rPr>
+        <w:rFonts w:ascii="Courier New" w:hAnsi="Courier New" w:cs="Courier New" w:hint="default"/>
+      </w:rPr>
+    </w:lvl>
+    <w:lvl w:ilvl="8" w:tplc="04150005" w:tentative="1">
+      <w:start w:val="1"/>
+      <w:numFmt w:val="bullet"/>
+      <w:lvlText w:val=""/>
+      <w:lvlJc w:val="left"/>
+      <w:pPr>
+        <w:ind w:left="6480" w:hanging="360"/>
+      </w:pPr>
+      <w:rPr>
+        <w:rFonts w:ascii="Wingdings" w:hAnsi="Wingdings" w:hint="default"/>
+      </w:rPr>
+    </w:lvl>
+  </w:abstractNum>
+  <w:abstractNum w:abstractNumId="3" w15:restartNumberingAfterBreak="0">
+    <w:nsid w:val="539F36E2"/>
+    <w:multiLevelType w:val="hybridMultilevel"/>
+    <w:tmpl w:val="9AC64D86"/>
+    <w:lvl w:ilvl="0" w:tplc="04150001">
+      <w:start w:val="1"/>
+      <w:numFmt w:val="bullet"/>
+      <w:lvlText w:val=""/>
+      <w:lvlJc w:val="left"/>
+      <w:pPr>
+        <w:ind w:left="720" w:hanging="360"/>
+      </w:pPr>
+      <w:rPr>
+        <w:rFonts w:ascii="Symbol" w:hAnsi="Symbol" w:hint="default"/>
+      </w:rPr>
+    </w:lvl>
+    <w:lvl w:ilvl="1" w:tplc="04150003" w:tentative="1">
+      <w:start w:val="1"/>
+      <w:numFmt w:val="bullet"/>
+      <w:lvlText w:val="o"/>
+      <w:lvlJc w:val="left"/>
+      <w:pPr>
+        <w:ind w:left="1440" w:hanging="360"/>
+      </w:pPr>
+      <w:rPr>
+        <w:rFonts w:ascii="Courier New" w:hAnsi="Courier New" w:cs="Courier New" w:hint="default"/>
+      </w:rPr>
+    </w:lvl>
+    <w:lvl w:ilvl="2" w:tplc="04150005" w:tentative="1">
+      <w:start w:val="1"/>
+      <w:numFmt w:val="bullet"/>
+      <w:lvlText w:val=""/>
+      <w:lvlJc w:val="left"/>
+      <w:pPr>
+        <w:ind w:left="2160" w:hanging="360"/>
+      </w:pPr>
+      <w:rPr>
+        <w:rFonts w:ascii="Wingdings" w:hAnsi="Wingdings" w:hint="default"/>
+      </w:rPr>
+    </w:lvl>
+    <w:lvl w:ilvl="3" w:tplc="04150001" w:tentative="1">
+      <w:start w:val="1"/>
+      <w:numFmt w:val="bullet"/>
+      <w:lvlText w:val=""/>
+      <w:lvlJc w:val="left"/>
+      <w:pPr>
+        <w:ind w:left="2880" w:hanging="360"/>
+      </w:pPr>
+      <w:rPr>
+        <w:rFonts w:ascii="Symbol" w:hAnsi="Symbol" w:hint="default"/>
+      </w:rPr>
+    </w:lvl>
+    <w:lvl w:ilvl="4" w:tplc="04150003" w:tentative="1">
+      <w:start w:val="1"/>
+      <w:numFmt w:val="bullet"/>
+      <w:lvlText w:val="o"/>
+      <w:lvlJc w:val="left"/>
+      <w:pPr>
+        <w:ind w:left="3600" w:hanging="360"/>
+      </w:pPr>
+      <w:rPr>
+        <w:rFonts w:ascii="Courier New" w:hAnsi="Courier New" w:cs="Courier New" w:hint="default"/>
+      </w:rPr>
+    </w:lvl>
+    <w:lvl w:ilvl="5" w:tplc="04150005" w:tentative="1">
+      <w:start w:val="1"/>
+      <w:numFmt w:val="bullet"/>
+      <w:lvlText w:val=""/>
+      <w:lvlJc w:val="left"/>
+      <w:pPr>
+        <w:ind w:left="4320" w:hanging="360"/>
+      </w:pPr>
+      <w:rPr>
+        <w:rFonts w:ascii="Wingdings" w:hAnsi="Wingdings" w:hint="default"/>
+      </w:rPr>
+    </w:lvl>
+    <w:lvl w:ilvl="6" w:tplc="04150001" w:tentative="1">
+      <w:start w:val="1"/>
+      <w:numFmt w:val="bullet"/>
+      <w:lvlText w:val=""/>
+      <w:lvlJc w:val="left"/>
+      <w:pPr>
+        <w:ind w:left="5040" w:hanging="360"/>
+      </w:pPr>
+      <w:rPr>
+        <w:rFonts w:ascii="Symbol" w:hAnsi="Symbol" w:hint="default"/>
+      </w:rPr>
+    </w:lvl>
+    <w:lvl w:ilvl="7" w:tplc="04150003" w:tentative="1">
+      <w:start w:val="1"/>
+      <w:numFmt w:val="bullet"/>
+      <w:lvlText w:val="o"/>
+      <w:lvlJc w:val="left"/>
+      <w:pPr>
+        <w:ind w:left="5760" w:hanging="360"/>
+      </w:pPr>
+      <w:rPr>
+        <w:rFonts w:ascii="Courier New" w:hAnsi="Courier New" w:cs="Courier New" w:hint="default"/>
+      </w:rPr>
+    </w:lvl>
+    <w:lvl w:ilvl="8" w:tplc="04150005" w:tentative="1">
+      <w:start w:val="1"/>
+      <w:numFmt w:val="bullet"/>
+      <w:lvlText w:val=""/>
+      <w:lvlJc w:val="left"/>
+      <w:pPr>
+        <w:ind w:left="6480" w:hanging="360"/>
+      </w:pPr>
+      <w:rPr>
+        <w:rFonts w:ascii="Wingdings" w:hAnsi="Wingdings" w:hint="default"/>
+      </w:rPr>
+    </w:lvl>
+  </w:abstractNum>
+  <w:abstractNum w:abstractNumId="4" w15:restartNumberingAfterBreak="0">
+    <w:nsid w:val="74715591"/>
+    <w:multiLevelType w:val="hybridMultilevel"/>
+    <w:tmpl w:val="45288B56"/>
+    <w:lvl w:ilvl="0" w:tplc="04150001">
+      <w:start w:val="1"/>
+      <w:numFmt w:val="bullet"/>
+      <w:lvlText w:val=""/>
+      <w:lvlJc w:val="left"/>
+      <w:pPr>
+        <w:ind w:left="720" w:hanging="360"/>
+      </w:pPr>
+      <w:rPr>
+        <w:rFonts w:ascii="Symbol" w:hAnsi="Symbol" w:hint="default"/>
+      </w:rPr>
+    </w:lvl>
+    <w:lvl w:ilvl="1" w:tplc="04150003" w:tentative="1">
+      <w:start w:val="1"/>
+      <w:numFmt w:val="bullet"/>
+      <w:lvlText w:val="o"/>
+      <w:lvlJc w:val="left"/>
+      <w:pPr>
+        <w:ind w:left="1440" w:hanging="360"/>
+      </w:pPr>
+      <w:rPr>
+        <w:rFonts w:ascii="Courier New" w:hAnsi="Courier New" w:cs="Courier New" w:hint="default"/>
+      </w:rPr>
+    </w:lvl>
+    <w:lvl w:ilvl="2" w:tplc="04150005" w:tentative="1">
+      <w:start w:val="1"/>
+      <w:numFmt w:val="bullet"/>
+      <w:lvlText w:val=""/>
+      <w:lvlJc w:val="left"/>
+      <w:pPr>
+        <w:ind w:left="2160" w:hanging="360"/>
+      </w:pPr>
+      <w:rPr>
+        <w:rFonts w:ascii="Wingdings" w:hAnsi="Wingdings" w:hint="default"/>
+      </w:rPr>
+    </w:lvl>
+    <w:lvl w:ilvl="3" w:tplc="04150001" w:tentative="1">
+      <w:start w:val="1"/>
+      <w:numFmt w:val="bullet"/>
+      <w:lvlText w:val=""/>
+      <w:lvlJc w:val="left"/>
+      <w:pPr>
+        <w:ind w:left="2880" w:hanging="360"/>
+      </w:pPr>
+      <w:rPr>
+        <w:rFonts w:ascii="Symbol" w:hAnsi="Symbol" w:hint="default"/>
+      </w:rPr>
+    </w:lvl>
+    <w:lvl w:ilvl="4" w:tplc="04150003" w:tentative="1">
+      <w:start w:val="1"/>
+      <w:numFmt w:val="bullet"/>
+      <w:lvlText w:val="o"/>
+      <w:lvlJc w:val="left"/>
+      <w:pPr>
+        <w:ind w:left="3600" w:hanging="360"/>
+      </w:pPr>
+      <w:rPr>
+        <w:rFonts w:ascii="Courier New" w:hAnsi="Courier New" w:cs="Courier New" w:hint="default"/>
+      </w:rPr>
+    </w:lvl>
+    <w:lvl w:ilvl="5" w:tplc="04150005" w:tentative="1">
+      <w:start w:val="1"/>
+      <w:numFmt w:val="bullet"/>
+      <w:lvlText w:val=""/>
+      <w:lvlJc w:val="left"/>
+      <w:pPr>
+        <w:ind w:left="4320" w:hanging="360"/>
+      </w:pPr>
+      <w:rPr>
+        <w:rFonts w:ascii="Wingdings" w:hAnsi="Wingdings" w:hint="default"/>
+      </w:rPr>
+    </w:lvl>
+    <w:lvl w:ilvl="6" w:tplc="04150001" w:tentative="1">
+      <w:start w:val="1"/>
+      <w:numFmt w:val="bullet"/>
+      <w:lvlText w:val=""/>
+      <w:lvlJc w:val="left"/>
+      <w:pPr>
+        <w:ind w:left="5040" w:hanging="360"/>
+      </w:pPr>
+      <w:rPr>
+        <w:rFonts w:ascii="Symbol" w:hAnsi="Symbol" w:hint="default"/>
+      </w:rPr>
+    </w:lvl>
+    <w:lvl w:ilvl="7" w:tplc="04150003" w:tentative="1">
+      <w:start w:val="1"/>
+      <w:numFmt w:val="bullet"/>
+      <w:lvlText w:val="o"/>
+      <w:lvlJc w:val="left"/>
+      <w:pPr>
+        <w:ind w:left="5760" w:hanging="360"/>
+      </w:pPr>
+      <w:rPr>
+        <w:rFonts w:ascii="Courier New" w:hAnsi="Courier New" w:cs="Courier New" w:hint="default"/>
+      </w:rPr>
+    </w:lvl>
+    <w:lvl w:ilvl="8" w:tplc="04150005" w:tentative="1">
+      <w:start w:val="1"/>
+      <w:numFmt w:val="bullet"/>
+      <w:lvlText w:val=""/>
+      <w:lvlJc w:val="left"/>
+      <w:pPr>
+        <w:ind w:left="6480" w:hanging="360"/>
+      </w:pPr>
+      <w:rPr>
+        <w:rFonts w:ascii="Wingdings" w:hAnsi="Wingdings" w:hint="default"/>
+      </w:rPr>
+    </w:lvl>
+  </w:abstractNum>
+  <w:abstractNum w:abstractNumId="5" w15:restartNumberingAfterBreak="0">
     <w:nsid w:val="7A001C73"/>
     <w:multiLevelType w:val="multilevel"/>
     <w:tmpl w:val="0415001D"/>
@@ -3369,10 +7165,22 @@
     </w:lvl>
   </w:abstractNum>
   <w:num w:numId="1" w16cid:durableId="387386709">
+    <w:abstractNumId w:val="5"/>
+  </w:num>
+  <w:num w:numId="2" w16cid:durableId="1236404104">
     <w:abstractNumId w:val="1"/>
   </w:num>
-  <w:num w:numId="2" w16cid:durableId="1236404104">
+  <w:num w:numId="3" w16cid:durableId="14423399">
+    <w:abstractNumId w:val="3"/>
+  </w:num>
+  <w:num w:numId="4" w16cid:durableId="269288979">
+    <w:abstractNumId w:val="2"/>
+  </w:num>
+  <w:num w:numId="5" w16cid:durableId="2093550532">
     <w:abstractNumId w:val="0"/>
+  </w:num>
+  <w:num w:numId="6" w16cid:durableId="343364055">
+    <w:abstractNumId w:val="4"/>
   </w:num>
 </w:numbering>
 </file>
@@ -4549,6 +8357,24 @@
       <w:spacing w:after="0"/>
     </w:pPr>
   </w:style>
+  <w:style w:type="paragraph" w:styleId="NormalWeb">
+    <w:name w:val="Normal (Web)"/>
+    <w:basedOn w:val="Normal"/>
+    <w:uiPriority w:val="99"/>
+    <w:semiHidden/>
+    <w:unhideWhenUsed/>
+    <w:rsid w:val="00F87693"/>
+    <w:pPr>
+      <w:spacing w:before="100" w:beforeAutospacing="1" w:after="100" w:afterAutospacing="1" w:line="240" w:lineRule="auto"/>
+    </w:pPr>
+    <w:rPr>
+      <w:rFonts w:ascii="Times New Roman" w:eastAsia="Times New Roman" w:hAnsi="Times New Roman" w:cs="Times New Roman"/>
+      <w:kern w:val="0"/>
+      <w:szCs w:val="24"/>
+      <w:lang w:val="pl-PL" w:eastAsia="pl-PL"/>
+      <w14:ligatures w14:val="none"/>
+    </w:rPr>
+  </w:style>
 </w:styles>
 </file>
 

</xml_diff>

<commit_message>
fix: correct spelling of 'Overview' in thesis document
</commit_message>
<xml_diff>
--- a/docs/thesis.docx
+++ b/docs/thesis.docx
@@ -5,8 +5,14 @@
     <w:p>
       <w:pPr>
         <w:jc w:val="right"/>
-      </w:pPr>
-      <w:r>
+        <w:rPr>
+          <w:lang w:val="pl-PL"/>
+        </w:rPr>
+      </w:pPr>
+      <w:r>
+        <w:rPr>
+          <w:lang w:val="pl-PL"/>
+        </w:rPr>
         <w:t>`</w:t>
       </w:r>
       <w:r>
@@ -53,16 +59,25 @@
     <w:p>
       <w:pPr>
         <w:jc w:val="center"/>
+        <w:rPr>
+          <w:lang w:val="pl-PL"/>
+        </w:rPr>
       </w:pPr>
     </w:p>
     <w:p>
       <w:pPr>
         <w:jc w:val="center"/>
+        <w:rPr>
+          <w:lang w:val="pl-PL"/>
+        </w:rPr>
       </w:pPr>
     </w:p>
     <w:p>
       <w:pPr>
         <w:jc w:val="center"/>
+        <w:rPr>
+          <w:lang w:val="pl-PL"/>
+        </w:rPr>
       </w:pPr>
     </w:p>
     <w:p>
@@ -7363,7 +7378,6 @@
         </w:rPr>
       </w:pPr>
       <w:bookmarkStart w:id="30" w:name="_Toc230035010"/>
-      <w:proofErr w:type="spellStart"/>
       <w:r>
         <w:rPr>
           <w:lang w:val="pl-PL"/>
@@ -7374,10 +7388,21 @@
         <w:rPr>
           <w:lang w:val="pl-PL"/>
         </w:rPr>
-        <w:t>verwiew</w:t>
+        <w:t>ver</w:t>
+      </w:r>
+      <w:r>
+        <w:rPr>
+          <w:lang w:val="pl-PL"/>
+        </w:rPr>
+        <w:t>v</w:t>
+      </w:r>
+      <w:r>
+        <w:rPr>
+          <w:lang w:val="pl-PL"/>
+        </w:rPr>
+        <w:t>iew</w:t>
       </w:r>
       <w:bookmarkEnd w:id="30"/>
-      <w:proofErr w:type="spellEnd"/>
     </w:p>
     <w:p>
       <w:r>

</xml_diff>